<commit_message>
Refine construction planning and remote role coordination
</commit_message>
<xml_diff>
--- a/docs/user_manual.docx
+++ b/docs/user_manual.docx
@@ -4,10 +4,15 @@
   <w:body>
     <w:p>
       <w:pPr>
-        <w:pStyle w:val="Title"/>
         <w:jc w:val="center"/>
       </w:pPr>
       <w:r>
+        <w:rPr>
+          <w:rFonts w:ascii="Aptos Display" w:hAnsi="Aptos Display"/>
+          <w:b/>
+          <w:color w:val="1F4E79"/>
+          <w:sz w:val="44"/>
+        </w:rPr>
         <w:t>screeps_omega Developer User Manual</w:t>
       </w:r>
     </w:p>
@@ -17,20 +22,12 @@
       </w:pPr>
       <w:r>
         <w:rPr>
+          <w:rFonts w:ascii="Aptos" w:hAnsi="Aptos"/>
           <w:i/>
+          <w:color w:val="555555"/>
+          <w:sz w:val="21"/>
         </w:rPr>
-        <w:t>Working reference for the dev/ sourcecode, operator config, and runtime behavior.</w:t>
-      </w:r>
-    </w:p>
-    <w:p>
-      <w:pPr>
-        <w:jc w:val="center"/>
-      </w:pPr>
-      <w:r>
-        <w:rPr>
-          <w:b/>
-        </w:rPr>
-        <w:t>Audience: developer to developer. Purpose: understand, operate, and extend the current bot safely.</w:t>
+        <w:t>Working manual for the current dev/ sourcecode. Single-room, controller-first, home-defense-only.</w:t>
       </w:r>
     </w:p>
     <w:p>
@@ -38,7 +35,31 @@
         <w:pStyle w:val="Heading1"/>
       </w:pPr>
       <w:r>
-        <w:t>1. How To Read This Manual</w:t>
+        <w:t>How To Read This Manual</w:t>
+      </w:r>
+    </w:p>
+    <w:p>
+      <w:pPr>
+        <w:spacing w:after="80"/>
+      </w:pPr>
+      <w:r>
+        <w:t>This manual describes the bot as it exists now. The current dev branch is a single-home-room Screeps bot that is optimized to reach a completed RCL8 before remote mining, claiming, or empire expansion return to scope.</w:t>
+      </w:r>
+    </w:p>
+    <w:p>
+      <w:pPr>
+        <w:spacing w:after="80"/>
+      </w:pPr>
+      <w:r>
+        <w:t>Use this document as an operator and developer reference. It is not a build bible. Start with room phase, build status, spawn queue, and config before changing deeper role or manager logic.</w:t>
+      </w:r>
+    </w:p>
+    <w:p>
+      <w:pPr>
+        <w:pStyle w:val="Heading1"/>
+      </w:pPr>
+      <w:r>
+        <w:t>Current Scope</w:t>
       </w:r>
     </w:p>
     <w:p>
@@ -46,7 +67,7 @@
         <w:pStyle w:val="ListBullet"/>
       </w:pPr>
       <w:r>
-        <w:t>This is a working user manual, not a build bible. It explains what the current code does, where the logic lives, and which files a developer should touch for common tasks.</w:t>
+        <w:t>One owned room only.</w:t>
       </w:r>
     </w:p>
     <w:p>
@@ -54,7 +75,7 @@
         <w:pStyle w:val="ListBullet"/>
       </w:pPr>
       <w:r>
-        <w:t>The bot is intentionally phase-driven. Most behavior changes should start by checking room phase, build status, spawn queue, and config before editing deeper logic.</w:t>
+        <w:t>Controller upgrade throughput is the main economic goal.</w:t>
       </w:r>
     </w:p>
     <w:p>
@@ -62,7 +83,23 @@
         <w:pStyle w:val="ListBullet"/>
       </w:pPr>
       <w:r>
-        <w:t>The dev/ folder is organized by subsystem: kernel, room orchestration, construction, roles, remote mining, defense, HUD, and stats.</w:t>
+        <w:t>Defense is reactive and home-room only.</w:t>
+      </w:r>
+    </w:p>
+    <w:p>
+      <w:pPr>
+        <w:pStyle w:val="ListBullet"/>
+      </w:pPr>
+      <w:r>
+        <w:t>Remote mining, remote defense, reservation, and empire control are intentionally removed from the active dev runtime.</w:t>
+      </w:r>
+    </w:p>
+    <w:p>
+      <w:pPr>
+        <w:pStyle w:val="ListBullet"/>
+      </w:pPr>
+      <w:r>
+        <w:t>CPU saving is a standing design rule.</w:t>
       </w:r>
     </w:p>
     <w:p>
@@ -70,87 +107,94 @@
         <w:pStyle w:val="Heading1"/>
       </w:pPr>
       <w:r>
-        <w:t>2. Runtime Flow</w:t>
+        <w:t>Runtime Flow</w:t>
       </w:r>
     </w:p>
     <w:p>
       <w:pPr>
-        <w:pStyle w:val="ListNumber"/>
+        <w:pStyle w:val="ListBullet"/>
       </w:pPr>
       <w:r>
-        <w:t>dev/main.js is the Screeps entry point. It calls kernel_loop each tick.</w:t>
+        <w:t>dev/main.js is the Screeps entry point and calls kernel_loop.</w:t>
       </w:r>
     </w:p>
     <w:p>
       <w:pPr>
-        <w:pStyle w:val="ListNumber"/>
+        <w:pStyle w:val="ListBullet"/>
       </w:pPr>
       <w:r>
-        <w:t>dev/kernel_loop.js owns top-level execution: memory cleanup, owned-room collection, per-room execution, and CPU snapshot recording.</w:t>
+        <w:t>dev/kernel_loop.js handles memory cleanup, owned-room collection, room execution, and CPU snapshot recording.</w:t>
       </w:r>
     </w:p>
     <w:p>
       <w:pPr>
-        <w:pStyle w:val="ListNumber"/>
+        <w:pStyle w:val="ListBullet"/>
       </w:pPr>
       <w:r>
-        <w:t>dev/room_manager.js runs one owned room at a time. It collects state and then runs construction, towers, spawn logic, creeps, signing, directives, and HUD.</w:t>
+        <w:t>dev/room_manager.js runs one owned room through state collection, construction, towers, spawning, creeps, signing, directives, and HUD.</w:t>
       </w:r>
     </w:p>
     <w:p>
       <w:pPr>
-        <w:pStyle w:val="ListNumber"/>
+        <w:pStyle w:val="ListBullet"/>
       </w:pPr>
       <w:r>
-        <w:t>dev/room_state.js is the shared fact collector. It decides the room phase and prepares the state that the other managers consume.</w:t>
+        <w:t>dev/room_state.js collects shared facts once and determines the current room phase.</w:t>
       </w:r>
     </w:p>
     <w:p>
       <w:pPr>
-        <w:pStyle w:val="ListNumber"/>
+        <w:pStyle w:val="ListBullet"/>
       </w:pPr>
       <w:r>
-        <w:t>Managers and roles avoid duplicate scans by reusing shared room state and runtime cache where possible.</w:t>
+        <w:t>utils.js holds tick-local runtime cache so managers and roles can reuse room scans.</w:t>
       </w:r>
     </w:p>
     <w:p>
       <w:pPr>
-        <w:pStyle w:val="IntenseQuote"/>
+        <w:pStyle w:val="Heading1"/>
       </w:pPr>
       <w:r>
-        <w:t>Core runtime file map</w:t>
+        <w:t>Room Phases</w:t>
+      </w:r>
+    </w:p>
+    <w:p>
+      <w:pPr>
+        <w:spacing w:after="80"/>
+      </w:pPr>
+      <w:r>
+        <w:t>The room phase is the main operating mode. Construction, spawning, and recovery behavior all key off this state.</w:t>
       </w:r>
     </w:p>
     <w:tbl>
       <w:tblPr>
         <w:tblStyle w:val="TableGrid"/>
         <w:tblW w:type="auto" w:w="0"/>
+        <w:jc w:val="center"/>
         <w:tblLook w:firstColumn="1" w:firstRow="1" w:lastColumn="0" w:lastRow="0" w:noHBand="0" w:noVBand="1" w:val="04A0"/>
       </w:tblPr>
       <w:tblGrid>
-        <w:gridCol w:w="4896"/>
-        <w:gridCol w:w="4896"/>
+        <w:gridCol w:w="4968"/>
+        <w:gridCol w:w="4968"/>
       </w:tblGrid>
       <w:tr>
         <w:tc>
           <w:tcPr>
-            <w:tcW w:type="dxa" w:w="4896"/>
-            <w:shd w:fill="D9EAF7"/>
+            <w:tcW w:type="dxa" w:w="4968"/>
           </w:tcPr>
           <w:p>
             <w:r>
-              <w:t>Area</w:t>
+              <w:t>Phase</w:t>
             </w:r>
           </w:p>
         </w:tc>
         <w:tc>
           <w:tcPr>
-            <w:tcW w:type="dxa" w:w="4896"/>
-            <w:shd w:fill="D9EAF7"/>
+            <w:tcW w:type="dxa" w:w="4968"/>
           </w:tcPr>
           <w:p>
             <w:r>
-              <w:t>Details</w:t>
+              <w:t>Meaning</w:t>
             </w:r>
           </w:p>
         </w:tc>
@@ -158,191 +202,7 @@
       <w:tr>
         <w:tc>
           <w:tcPr>
-            <w:tcW w:type="dxa" w:w="4896"/>
-          </w:tcPr>
-          <w:p>
-            <w:r>
-              <w:t>main.js</w:t>
-            </w:r>
-          </w:p>
-        </w:tc>
-        <w:tc>
-          <w:tcPr>
-            <w:tcW w:type="dxa" w:w="4896"/>
-          </w:tcPr>
-          <w:p>
-            <w:r>
-              <w:t>Screeps entry point.</w:t>
-            </w:r>
-          </w:p>
-        </w:tc>
-      </w:tr>
-      <w:tr>
-        <w:tc>
-          <w:tcPr>
-            <w:tcW w:type="dxa" w:w="4896"/>
-          </w:tcPr>
-          <w:p>
-            <w:r>
-              <w:t>kernel_loop.js</w:t>
-            </w:r>
-          </w:p>
-        </w:tc>
-        <w:tc>
-          <w:tcPr>
-            <w:tcW w:type="dxa" w:w="4896"/>
-          </w:tcPr>
-          <w:p>
-            <w:r>
-              <w:t>Top-level per-tick control flow.</w:t>
-            </w:r>
-          </w:p>
-        </w:tc>
-      </w:tr>
-      <w:tr>
-        <w:tc>
-          <w:tcPr>
-            <w:tcW w:type="dxa" w:w="4896"/>
-          </w:tcPr>
-          <w:p>
-            <w:r>
-              <w:t>kernel_memory.js</w:t>
-            </w:r>
-          </w:p>
-        </w:tc>
-        <w:tc>
-          <w:tcPr>
-            <w:tcW w:type="dxa" w:w="4896"/>
-          </w:tcPr>
-          <w:p>
-            <w:r>
-              <w:t>Memory cleanup / maintenance.</w:t>
-            </w:r>
-          </w:p>
-        </w:tc>
-      </w:tr>
-      <w:tr>
-        <w:tc>
-          <w:tcPr>
-            <w:tcW w:type="dxa" w:w="4896"/>
-          </w:tcPr>
-          <w:p>
-            <w:r>
-              <w:t>kernel_profiler.js</w:t>
-            </w:r>
-          </w:p>
-        </w:tc>
-        <w:tc>
-          <w:tcPr>
-            <w:tcW w:type="dxa" w:w="4896"/>
-          </w:tcPr>
-          <w:p>
-            <w:r>
-              <w:t>CPU section profiler used by stats_manager.</w:t>
-            </w:r>
-          </w:p>
-        </w:tc>
-      </w:tr>
-      <w:tr>
-        <w:tc>
-          <w:tcPr>
-            <w:tcW w:type="dxa" w:w="4896"/>
-          </w:tcPr>
-          <w:p>
-            <w:r>
-              <w:t>room_manager.js</w:t>
-            </w:r>
-          </w:p>
-        </w:tc>
-        <w:tc>
-          <w:tcPr>
-            <w:tcW w:type="dxa" w:w="4896"/>
-          </w:tcPr>
-          <w:p>
-            <w:r>
-              <w:t>Owned-room execution pipeline.</w:t>
-            </w:r>
-          </w:p>
-        </w:tc>
-      </w:tr>
-      <w:tr>
-        <w:tc>
-          <w:tcPr>
-            <w:tcW w:type="dxa" w:w="4896"/>
-          </w:tcPr>
-          <w:p>
-            <w:r>
-              <w:t>room_state.js</w:t>
-            </w:r>
-          </w:p>
-        </w:tc>
-        <w:tc>
-          <w:tcPr>
-            <w:tcW w:type="dxa" w:w="4896"/>
-          </w:tcPr>
-          <w:p>
-            <w:r>
-              <w:t>Shared room facts, role maps, phase, build status, defense state.</w:t>
-            </w:r>
-          </w:p>
-        </w:tc>
-      </w:tr>
-    </w:tbl>
-    <w:p/>
-    <w:p>
-      <w:pPr>
-        <w:pStyle w:val="Heading1"/>
-      </w:pPr>
-      <w:r>
-        <w:t>3. Room Phase Model</w:t>
-      </w:r>
-    </w:p>
-    <w:p>
-      <w:pPr>
-        <w:pStyle w:val="IntenseQuote"/>
-      </w:pPr>
-      <w:r>
-        <w:t>Phase quick reference</w:t>
-      </w:r>
-    </w:p>
-    <w:tbl>
-      <w:tblPr>
-        <w:tblStyle w:val="TableGrid"/>
-        <w:tblW w:type="auto" w:w="0"/>
-        <w:tblLook w:firstColumn="1" w:firstRow="1" w:lastColumn="0" w:lastRow="0" w:noHBand="0" w:noVBand="1" w:val="04A0"/>
-      </w:tblPr>
-      <w:tblGrid>
-        <w:gridCol w:w="4896"/>
-        <w:gridCol w:w="4896"/>
-      </w:tblGrid>
-      <w:tr>
-        <w:tc>
-          <w:tcPr>
-            <w:tcW w:type="dxa" w:w="4896"/>
-            <w:shd w:fill="D9EAF7"/>
-          </w:tcPr>
-          <w:p>
-            <w:r>
-              <w:t>Area</w:t>
-            </w:r>
-          </w:p>
-        </w:tc>
-        <w:tc>
-          <w:tcPr>
-            <w:tcW w:type="dxa" w:w="4896"/>
-            <w:shd w:fill="D9EAF7"/>
-          </w:tcPr>
-          <w:p>
-            <w:r>
-              <w:t>Details</w:t>
-            </w:r>
-          </w:p>
-        </w:tc>
-      </w:tr>
-      <w:tr>
-        <w:tc>
-          <w:tcPr>
-            <w:tcW w:type="dxa" w:w="4896"/>
+            <w:tcW w:type="dxa" w:w="4968"/>
           </w:tcPr>
           <w:p>
             <w:r>
@@ -352,7 +212,7 @@
         </w:tc>
         <w:tc>
           <w:tcPr>
-            <w:tcW w:type="dxa" w:w="4896"/>
+            <w:tcW w:type="dxa" w:w="4968"/>
           </w:tcPr>
           <w:p>
             <w:r>
@@ -364,7 +224,7 @@
       <w:tr>
         <w:tc>
           <w:tcPr>
-            <w:tcW w:type="dxa" w:w="4896"/>
+            <w:tcW w:type="dxa" w:w="4968"/>
           </w:tcPr>
           <w:p>
             <w:r>
@@ -374,11 +234,11 @@
         </w:tc>
         <w:tc>
           <w:tcPr>
-            <w:tcW w:type="dxa" w:w="4896"/>
+            <w:tcW w:type="dxa" w:w="4968"/>
           </w:tcPr>
           <w:p>
             <w:r>
-              <w:t>Build source containers, controller container, and road backbone. This is the container and path network phase.</w:t>
+              <w:t>Core source containers and backbone roads are built and worker replacement begins.</w:t>
             </w:r>
           </w:p>
         </w:tc>
@@ -386,7 +246,7 @@
       <w:tr>
         <w:tc>
           <w:tcPr>
-            <w:tcW w:type="dxa" w:w="4896"/>
+            <w:tcW w:type="dxa" w:w="4968"/>
           </w:tcPr>
           <w:p>
             <w:r>
@@ -396,11 +256,11 @@
         </w:tc>
         <w:tc>
           <w:tcPr>
-            <w:tcW w:type="dxa" w:w="4896"/>
+            <w:tcW w:type="dxa" w:w="4968"/>
           </w:tcPr>
           <w:p>
             <w:r>
-              <w:t>Build extension stamps, first tower, storage, internal roads, and defense baseline.</w:t>
+              <w:t>Extensions, tower, storage, roads, and defense are built while the economy stabilizes.</w:t>
             </w:r>
           </w:p>
         </w:tc>
@@ -408,7 +268,7 @@
       <w:tr>
         <w:tc>
           <w:tcPr>
-            <w:tcW w:type="dxa" w:w="4896"/>
+            <w:tcW w:type="dxa" w:w="4968"/>
           </w:tcPr>
           <w:p>
             <w:r>
@@ -418,11 +278,11 @@
         </w:tc>
         <w:tc>
           <w:tcPr>
-            <w:tcW w:type="dxa" w:w="4896"/>
+            <w:tcW w:type="dxa" w:w="4968"/>
           </w:tcPr>
           <w:p>
             <w:r>
-              <w:t>Keep the current RCL core layout complete and economy healthy.</w:t>
+              <w:t>Current-RCL home layout is complete enough to run cleanly and support higher throughput.</w:t>
             </w:r>
           </w:p>
         </w:tc>
@@ -430,7 +290,7 @@
       <w:tr>
         <w:tc>
           <w:tcPr>
-            <w:tcW w:type="dxa" w:w="4896"/>
+            <w:tcW w:type="dxa" w:w="4968"/>
           </w:tcPr>
           <w:p>
             <w:r>
@@ -440,11 +300,11 @@
         </w:tc>
         <w:tc>
           <w:tcPr>
-            <w:tcW w:type="dxa" w:w="4896"/>
+            <w:tcW w:type="dxa" w:w="4968"/>
           </w:tcPr>
           <w:p>
             <w:r>
-              <w:t>Current-RCL roadmap expands to link backbone planning and placement.</w:t>
+              <w:t>Link backbone planning and buildout begin.</w:t>
             </w:r>
           </w:p>
         </w:tc>
@@ -452,7 +312,7 @@
       <w:tr>
         <w:tc>
           <w:tcPr>
-            <w:tcW w:type="dxa" w:w="4896"/>
+            <w:tcW w:type="dxa" w:w="4968"/>
           </w:tcPr>
           <w:p>
             <w:r>
@@ -462,23 +322,22 @@
         </w:tc>
         <w:tc>
           <w:tcPr>
-            <w:tcW w:type="dxa" w:w="4896"/>
+            <w:tcW w:type="dxa" w:w="4968"/>
           </w:tcPr>
           <w:p>
             <w:r>
-              <w:t>Current-RCL roadmap expands to terminal, extractor, and first lab cluster.</w:t>
+              <w:t>Terminal, extractor, and first lab cluster planning/buildout begin.</w:t>
             </w:r>
           </w:p>
         </w:tc>
       </w:tr>
     </w:tbl>
-    <w:p/>
     <w:p>
       <w:pPr>
-        <w:pStyle w:val="ListBullet"/>
+        <w:pStyle w:val="Heading1"/>
       </w:pPr>
       <w:r>
-        <w:t>Phase truth is determined in room_state.js using construction_status.js plus economy signals.</w:t>
+        <w:t>Construction System</w:t>
       </w:r>
     </w:p>
     <w:p>
@@ -486,7 +345,7 @@
         <w:pStyle w:val="ListBullet"/>
       </w:pPr>
       <w:r>
-        <w:t>The construction roadmap can advance by controller level even when the high-level room phase remains stable. This is why roadmapPhase and room phase are related but not identical.</w:t>
+        <w:t>construction_roadmap.js defines the intent for each phase and later RCL roadmap stage.</w:t>
       </w:r>
     </w:p>
     <w:p>
@@ -494,7 +353,31 @@
         <w:pStyle w:val="ListBullet"/>
       </w:pPr>
       <w:r>
-        <w:t>If a room collapses badly enough, the phase logic can fall back toward bootstrap behavior so recovery work resumes.</w:t>
+        <w:t>construction_status.js is the shared build truth. It calculates counts, readiness, and future-plan state.</w:t>
+      </w:r>
+    </w:p>
+    <w:p>
+      <w:pPr>
+        <w:pStyle w:val="ListBullet"/>
+      </w:pPr>
+      <w:r>
+        <w:t>construction_manager.js places construction sites in roadmap order and respects the site cap.</w:t>
+      </w:r>
+    </w:p>
+    <w:p>
+      <w:pPr>
+        <w:pStyle w:val="ListBullet"/>
+      </w:pPr>
+      <w:r>
+        <w:t>Advanced RCL5/RCL6 planning is cache-driven. Future link, terminal, extractor, and lab placement is stored in room memory and reused instead of being recomputed every tick.</w:t>
+      </w:r>
+    </w:p>
+    <w:p>
+      <w:pPr>
+        <w:pStyle w:val="ListBullet"/>
+      </w:pPr>
+      <w:r>
+        <w:t>The old controller-container requirement has been removed from active planning. Backbone roads now connect the spawn network to the controller path directly.</w:t>
       </w:r>
     </w:p>
     <w:p>
@@ -502,7 +385,7 @@
         <w:pStyle w:val="Heading1"/>
       </w:pPr>
       <w:r>
-        <w:t>4. Construction System</w:t>
+        <w:t>Spawn System And Bodies</w:t>
       </w:r>
     </w:p>
     <w:p>
@@ -510,7 +393,7 @@
         <w:pStyle w:val="ListBullet"/>
       </w:pPr>
       <w:r>
-        <w:t>construction_roadmap.js defines what each phase and later RCL roadmap is trying to build.</w:t>
+        <w:t>spawn_manager.js builds a priority queue every tick and writes that queue to room memory for inspection.</w:t>
       </w:r>
     </w:p>
     <w:p>
@@ -518,7 +401,7 @@
         <w:pStyle w:val="ListBullet"/>
       </w:pPr>
       <w:r>
-        <w:t>construction_status.js measures built, planned, and needed structure counts and exposes readiness flags.</w:t>
+        <w:t>bodies.js chooses role bodies from room energy capacity and defender threat level.</w:t>
       </w:r>
     </w:p>
     <w:p>
@@ -526,7 +409,7 @@
         <w:pStyle w:val="ListBullet"/>
       </w:pPr>
       <w:r>
-        <w:t>construction_manager.js places construction sites in roadmap order and respects site caps at all times.</w:t>
+        <w:t>The active workforce is home-only: jrworker, worker, miner, hauler, upgrader, repair, defender.</w:t>
       </w:r>
     </w:p>
     <w:p>
@@ -534,7 +417,7 @@
         <w:pStyle w:val="ListBullet"/>
       </w:pPr>
       <w:r>
-        <w:t>Remote construction is planned separately and more slowly than home-room construction to save CPU.</w:t>
+        <w:t>Upgraders no longer require a dedicated controller container target to spawn or operate.</w:t>
       </w:r>
     </w:p>
     <w:p>
@@ -542,47 +425,46 @@
         <w:pStyle w:val="ListBullet"/>
       </w:pPr>
       <w:r>
-        <w:t>Advanced RCL5/RCL6 placement is cache-driven: future plans are stored in room memory and reused for live placement instead of being recomputed every tick.</w:t>
+        <w:t>Upgrader body tiers now include more carry and move so they can self-supply cleanly.</w:t>
       </w:r>
     </w:p>
     <w:p>
       <w:pPr>
-        <w:pStyle w:val="IntenseQuote"/>
+        <w:pStyle w:val="Heading1"/>
       </w:pPr>
       <w:r>
-        <w:t>Construction behavior summary</w:t>
+        <w:t>Role Model</w:t>
       </w:r>
     </w:p>
     <w:tbl>
       <w:tblPr>
         <w:tblStyle w:val="TableGrid"/>
         <w:tblW w:type="auto" w:w="0"/>
+        <w:jc w:val="center"/>
         <w:tblLook w:firstColumn="1" w:firstRow="1" w:lastColumn="0" w:lastRow="0" w:noHBand="0" w:noVBand="1" w:val="04A0"/>
       </w:tblPr>
       <w:tblGrid>
-        <w:gridCol w:w="4896"/>
-        <w:gridCol w:w="4896"/>
+        <w:gridCol w:w="4968"/>
+        <w:gridCol w:w="4968"/>
       </w:tblGrid>
       <w:tr>
         <w:tc>
           <w:tcPr>
-            <w:tcW w:type="dxa" w:w="4896"/>
-            <w:shd w:fill="D9EAF7"/>
+            <w:tcW w:type="dxa" w:w="4968"/>
           </w:tcPr>
           <w:p>
             <w:r>
-              <w:t>Area</w:t>
+              <w:t>Role</w:t>
             </w:r>
           </w:p>
         </w:tc>
         <w:tc>
           <w:tcPr>
-            <w:tcW w:type="dxa" w:w="4896"/>
-            <w:shd w:fill="D9EAF7"/>
+            <w:tcW w:type="dxa" w:w="4968"/>
           </w:tcPr>
           <w:p>
             <w:r>
-              <w:t>Details</w:t>
+              <w:t>Current job</w:t>
             </w:r>
           </w:p>
         </w:tc>
@@ -590,233 +472,7 @@
       <w:tr>
         <w:tc>
           <w:tcPr>
-            <w:tcW w:type="dxa" w:w="4896"/>
-          </w:tcPr>
-          <w:p>
-            <w:r>
-              <w:t>Bootstrap buildout</w:t>
-            </w:r>
-          </w:p>
-        </w:tc>
-        <w:tc>
-          <w:tcPr>
-            <w:tcW w:type="dxa" w:w="4896"/>
-          </w:tcPr>
-          <w:p>
-            <w:r>
-              <w:t>Source containers, controller container, anchor roads, and backbone roads.</w:t>
-            </w:r>
-          </w:p>
-        </w:tc>
-      </w:tr>
-      <w:tr>
-        <w:tc>
-          <w:tcPr>
-            <w:tcW w:type="dxa" w:w="4896"/>
-          </w:tcPr>
-          <w:p>
-            <w:r>
-              <w:t>Developing buildout</w:t>
-            </w:r>
-          </w:p>
-        </w:tc>
-        <w:tc>
-          <w:tcPr>
-            <w:tcW w:type="dxa" w:w="4896"/>
-          </w:tcPr>
-          <w:p>
-            <w:r>
-              <w:t>Extension stamps, tower stamp, storage hub, internal roads, and defense ring.</w:t>
-            </w:r>
-          </w:p>
-        </w:tc>
-      </w:tr>
-      <w:tr>
-        <w:tc>
-          <w:tcPr>
-            <w:tcW w:type="dxa" w:w="4896"/>
-          </w:tcPr>
-          <w:p>
-            <w:r>
-              <w:t>RCL5 buildout</w:t>
-            </w:r>
-          </w:p>
-        </w:tc>
-        <w:tc>
-          <w:tcPr>
-            <w:tcW w:type="dxa" w:w="4896"/>
-          </w:tcPr>
-          <w:p>
-            <w:r>
-              <w:t>Link sites are placed from the cached future plan.</w:t>
-            </w:r>
-          </w:p>
-        </w:tc>
-      </w:tr>
-      <w:tr>
-        <w:tc>
-          <w:tcPr>
-            <w:tcW w:type="dxa" w:w="4896"/>
-          </w:tcPr>
-          <w:p>
-            <w:r>
-              <w:t>RCL6 buildout</w:t>
-            </w:r>
-          </w:p>
-        </w:tc>
-        <w:tc>
-          <w:tcPr>
-            <w:tcW w:type="dxa" w:w="4896"/>
-          </w:tcPr>
-          <w:p>
-            <w:r>
-              <w:t>Terminal, extractor, and first lab cluster are placed from the cached future plan.</w:t>
-            </w:r>
-          </w:p>
-        </w:tc>
-      </w:tr>
-      <w:tr>
-        <w:tc>
-          <w:tcPr>
-            <w:tcW w:type="dxa" w:w="4896"/>
-          </w:tcPr>
-          <w:p>
-            <w:r>
-              <w:t>Stamp usage</w:t>
-            </w:r>
-          </w:p>
-        </w:tc>
-        <w:tc>
-          <w:tcPr>
-            <w:tcW w:type="dxa" w:w="4896"/>
-          </w:tcPr>
-          <w:p>
-            <w:r>
-              <w:t>anchor_v1, extension_plus_v1, tower_cluster_v1, storage_hub_v1, and lab_cluster_v1 drive repeatable placement.</w:t>
-            </w:r>
-          </w:p>
-        </w:tc>
-      </w:tr>
-    </w:tbl>
-    <w:p/>
-    <w:p>
-      <w:pPr>
-        <w:pStyle w:val="ListBullet"/>
-      </w:pPr>
-      <w:r>
-        <w:t>Storage now uses a dedicated storage hub stamp instead of ad hoc placement.</w:t>
-      </w:r>
-    </w:p>
-    <w:p>
-      <w:pPr>
-        <w:pStyle w:val="ListBullet"/>
-      </w:pPr>
-      <w:r>
-        <w:t>Storage link and terminal prefer reserved slots attached to that storage hub.</w:t>
-      </w:r>
-    </w:p>
-    <w:p>
-      <w:pPr>
-        <w:pStyle w:val="ListBullet"/>
-      </w:pPr>
-      <w:r>
-        <w:t>Labs prefer a stamped three-lab cluster anchored from the storage hub.</w:t>
-      </w:r>
-    </w:p>
-    <w:p>
-      <w:pPr>
-        <w:pStyle w:val="ListBullet"/>
-      </w:pPr>
-      <w:r>
-        <w:t>Extractor is not stamped because its location is fixed by the mineral tile.</w:t>
-      </w:r>
-    </w:p>
-    <w:p>
-      <w:pPr>
-        <w:pStyle w:val="Heading1"/>
-      </w:pPr>
-      <w:r>
-        <w:t>5. Spawn System And Bodies</w:t>
-      </w:r>
-    </w:p>
-    <w:p>
-      <w:pPr>
-        <w:pStyle w:val="ListBullet"/>
-      </w:pPr>
-      <w:r>
-        <w:t>spawn_manager.js creates a per-room priority queue each tick and writes a readable copy to room memory for inspection.</w:t>
-      </w:r>
-    </w:p>
-    <w:p>
-      <w:pPr>
-        <w:pStyle w:val="ListBullet"/>
-      </w:pPr>
-      <w:r>
-        <w:t>bodies.js selects bodies from room energy capacity and, for defenders, threat level.</w:t>
-      </w:r>
-    </w:p>
-    <w:p>
-      <w:pPr>
-        <w:pStyle w:val="ListBullet"/>
-      </w:pPr>
-      <w:r>
-        <w:t>Spawn logic is phase-aware. Early phases are intentionally different from post-bootstrap phases.</w:t>
-      </w:r>
-    </w:p>
-    <w:p>
-      <w:pPr>
-        <w:pStyle w:val="ListBullet"/>
-      </w:pPr>
-      <w:r>
-        <w:t>Remote mining and reservation are gated so they do not continue when the home room falls back into bootstrap behavior.</w:t>
-      </w:r>
-    </w:p>
-    <w:p>
-      <w:pPr>
-        <w:pStyle w:val="IntenseQuote"/>
-      </w:pPr>
-      <w:r>
-        <w:t>Home and defense roles</w:t>
-      </w:r>
-    </w:p>
-    <w:tbl>
-      <w:tblPr>
-        <w:tblStyle w:val="TableGrid"/>
-        <w:tblW w:type="auto" w:w="0"/>
-        <w:tblLook w:firstColumn="1" w:firstRow="1" w:lastColumn="0" w:lastRow="0" w:noHBand="0" w:noVBand="1" w:val="04A0"/>
-      </w:tblPr>
-      <w:tblGrid>
-        <w:gridCol w:w="4896"/>
-        <w:gridCol w:w="4896"/>
-      </w:tblGrid>
-      <w:tr>
-        <w:tc>
-          <w:tcPr>
-            <w:tcW w:type="dxa" w:w="4896"/>
-            <w:shd w:fill="D9EAF7"/>
-          </w:tcPr>
-          <w:p>
-            <w:r>
-              <w:t>Area</w:t>
-            </w:r>
-          </w:p>
-        </w:tc>
-        <w:tc>
-          <w:tcPr>
-            <w:tcW w:type="dxa" w:w="4896"/>
-            <w:shd w:fill="D9EAF7"/>
-          </w:tcPr>
-          <w:p>
-            <w:r>
-              <w:t>Details</w:t>
-            </w:r>
-          </w:p>
-        </w:tc>
-      </w:tr>
-      <w:tr>
-        <w:tc>
-          <w:tcPr>
-            <w:tcW w:type="dxa" w:w="4896"/>
+            <w:tcW w:type="dxa" w:w="4968"/>
           </w:tcPr>
           <w:p>
             <w:r>
@@ -826,11 +482,11 @@
         </w:tc>
         <w:tc>
           <w:tcPr>
-            <w:tcW w:type="dxa" w:w="4896"/>
+            <w:tcW w:type="dxa" w:w="4968"/>
           </w:tcPr>
           <w:p>
             <w:r>
-              <w:t>Bootstrap-only labor. Used to survive and recover early room states.</w:t>
+              <w:t>Bootstrap-only survival labor. Pulls from storage or containers first, then harvests.</w:t>
             </w:r>
           </w:p>
         </w:tc>
@@ -838,7 +494,7 @@
       <w:tr>
         <w:tc>
           <w:tcPr>
-            <w:tcW w:type="dxa" w:w="4896"/>
+            <w:tcW w:type="dxa" w:w="4968"/>
           </w:tcPr>
           <w:p>
             <w:r>
@@ -848,11 +504,11 @@
         </w:tc>
         <w:tc>
           <w:tcPr>
-            <w:tcW w:type="dxa" w:w="4896"/>
+            <w:tcW w:type="dxa" w:w="4968"/>
           </w:tcPr>
           <w:p>
             <w:r>
-              <w:t>General home-room builder / filler role.</w:t>
+              <w:t>General build and refill role with shared room logistics.</w:t>
             </w:r>
           </w:p>
         </w:tc>
@@ -860,7 +516,7 @@
       <w:tr>
         <w:tc>
           <w:tcPr>
-            <w:tcW w:type="dxa" w:w="4896"/>
+            <w:tcW w:type="dxa" w:w="4968"/>
           </w:tcPr>
           <w:p>
             <w:r>
@@ -870,11 +526,11 @@
         </w:tc>
         <w:tc>
           <w:tcPr>
-            <w:tcW w:type="dxa" w:w="4896"/>
+            <w:tcW w:type="dxa" w:w="4968"/>
           </w:tcPr>
           <w:p>
             <w:r>
-              <w:t>Dedicated source harvesting once source containers exist.</w:t>
+              <w:t>One per source. Sits on the source container and harvests efficiently.</w:t>
             </w:r>
           </w:p>
         </w:tc>
@@ -882,7 +538,7 @@
       <w:tr>
         <w:tc>
           <w:tcPr>
-            <w:tcW w:type="dxa" w:w="4896"/>
+            <w:tcW w:type="dxa" w:w="4968"/>
           </w:tcPr>
           <w:p>
             <w:r>
@@ -892,11 +548,11 @@
         </w:tc>
         <w:tc>
           <w:tcPr>
-            <w:tcW w:type="dxa" w:w="4896"/>
+            <w:tcW w:type="dxa" w:w="4968"/>
           </w:tcPr>
           <w:p>
             <w:r>
-              <w:t>Room energy transport and refill role.</w:t>
+              <w:t>Moves source-side energy into the room economy. No controller-container reservation path remains.</w:t>
             </w:r>
           </w:p>
         </w:tc>
@@ -904,7 +560,7 @@
       <w:tr>
         <w:tc>
           <w:tcPr>
-            <w:tcW w:type="dxa" w:w="4896"/>
+            <w:tcW w:type="dxa" w:w="4968"/>
           </w:tcPr>
           <w:p>
             <w:r>
@@ -914,11 +570,11 @@
         </w:tc>
         <w:tc>
           <w:tcPr>
-            <w:tcW w:type="dxa" w:w="4896"/>
+            <w:tcW w:type="dxa" w:w="4968"/>
           </w:tcPr>
           <w:p>
             <w:r>
-              <w:t>Controller progress role.</w:t>
+              <w:t>Self-supplied controller role. Gathers energy from shared room buffers and upgrades only.</w:t>
             </w:r>
           </w:p>
         </w:tc>
@@ -926,7 +582,7 @@
       <w:tr>
         <w:tc>
           <w:tcPr>
-            <w:tcW w:type="dxa" w:w="4896"/>
+            <w:tcW w:type="dxa" w:w="4968"/>
           </w:tcPr>
           <w:p>
             <w:r>
@@ -936,11 +592,11 @@
         </w:tc>
         <w:tc>
           <w:tcPr>
-            <w:tcW w:type="dxa" w:w="4896"/>
+            <w:tcW w:type="dxa" w:w="4968"/>
           </w:tcPr>
           <w:p>
             <w:r>
-              <w:t>Infrastructure maintenance role.</w:t>
+              <w:t>Maintains roads, containers, defenses, and builds or upgrades as fallback.</w:t>
             </w:r>
           </w:p>
         </w:tc>
@@ -948,7 +604,7 @@
       <w:tr>
         <w:tc>
           <w:tcPr>
-            <w:tcW w:type="dxa" w:w="4896"/>
+            <w:tcW w:type="dxa" w:w="4968"/>
           </w:tcPr>
           <w:p>
             <w:r>
@@ -958,11 +614,357 @@
         </w:tc>
         <w:tc>
           <w:tcPr>
-            <w:tcW w:type="dxa" w:w="4896"/>
+            <w:tcW w:type="dxa" w:w="4968"/>
           </w:tcPr>
           <w:p>
             <w:r>
-              <w:t>Home-room melee defense role.</w:t>
+              <w:t>Home-room reactive melee defense only.</w:t>
+            </w:r>
+          </w:p>
+        </w:tc>
+      </w:tr>
+    </w:tbl>
+    <w:p>
+      <w:pPr>
+        <w:pStyle w:val="Heading1"/>
+      </w:pPr>
+      <w:r>
+        <w:t>Logistics And Upgrader Model</w:t>
+      </w:r>
+    </w:p>
+    <w:p>
+      <w:pPr>
+        <w:pStyle w:val="ListBullet"/>
+      </w:pPr>
+      <w:r>
+        <w:t>logistics_manager.js defines shared energy withdrawal and delivery rules.</w:t>
+      </w:r>
+    </w:p>
+    <w:p>
+      <w:pPr>
+        <w:pStyle w:val="ListBullet"/>
+      </w:pPr>
+      <w:r>
+        <w:t>General withdrawal order is storage first, then source containers, then active harvesting as fallback.</w:t>
+      </w:r>
+    </w:p>
+    <w:p>
+      <w:pPr>
+        <w:pStyle w:val="ListBullet"/>
+      </w:pPr>
+      <w:r>
+        <w:t>Haulers now feed spawn, extensions, storage, and tower reserves. They do not reserve energy for a controller container.</w:t>
+      </w:r>
+    </w:p>
+    <w:p>
+      <w:pPr>
+        <w:pStyle w:val="ListBullet"/>
+      </w:pPr>
+      <w:r>
+        <w:t>Upgraders now behave like other self-supplied creeps on the pickup side, but they remain controller-only on the work side.</w:t>
+      </w:r>
+    </w:p>
+    <w:p>
+      <w:pPr>
+        <w:pStyle w:val="Heading1"/>
+      </w:pPr>
+      <w:r>
+        <w:t>Defense</w:t>
+      </w:r>
+    </w:p>
+    <w:p>
+      <w:pPr>
+        <w:pStyle w:val="ListBullet"/>
+      </w:pPr>
+      <w:r>
+        <w:t>defense_manager.js is now a home-room-only threat planner.</w:t>
+      </w:r>
+    </w:p>
+    <w:p>
+      <w:pPr>
+        <w:pStyle w:val="ListBullet"/>
+      </w:pPr>
+      <w:r>
+        <w:t>spawn_manager.js reactively spawns defender creeps when home threats appear.</w:t>
+      </w:r>
+    </w:p>
+    <w:p>
+      <w:pPr>
+        <w:pStyle w:val="ListBullet"/>
+      </w:pPr>
+      <w:r>
+        <w:t>creep_manager.js makes civilian creeps yield to active defense before normal role execution.</w:t>
+      </w:r>
+    </w:p>
+    <w:p>
+      <w:pPr>
+        <w:pStyle w:val="ListBullet"/>
+      </w:pPr>
+      <w:r>
+        <w:t>tower_manager.js remains narrow: attack, heal, and repair without broad combat rewrite.</w:t>
+      </w:r>
+    </w:p>
+    <w:p>
+      <w:pPr>
+        <w:pStyle w:val="Heading1"/>
+      </w:pPr>
+      <w:r>
+        <w:t>HUD And Directives</w:t>
+      </w:r>
+    </w:p>
+    <w:p>
+      <w:pPr>
+        <w:pStyle w:val="ListBullet"/>
+      </w:pPr>
+      <w:r>
+        <w:t>hud.js is now home-room only. It shows room status, role counts, construction checklist, source lines, creep labels, and console summary.</w:t>
+      </w:r>
+    </w:p>
+    <w:p>
+      <w:pPr>
+        <w:pStyle w:val="ListBullet"/>
+      </w:pPr>
+      <w:r>
+        <w:t>The remote panels and remote creep overlays have been removed from the active HUD.</w:t>
+      </w:r>
+    </w:p>
+    <w:p>
+      <w:pPr>
+        <w:pStyle w:val="ListBullet"/>
+      </w:pPr>
+      <w:r>
+        <w:t>directive_manager.js provides themed room-level console updates for phase changes, milestones, performance, progress, construction, and operations.</w:t>
+      </w:r>
+    </w:p>
+    <w:p>
+      <w:pPr>
+        <w:pStyle w:val="Heading1"/>
+      </w:pPr>
+      <w:r>
+        <w:t>CPU Visibility</w:t>
+      </w:r>
+    </w:p>
+    <w:p>
+      <w:pPr>
+        <w:pStyle w:val="ListBullet"/>
+      </w:pPr>
+      <w:r>
+        <w:t>stats_manager.js stores short CPU history and prints overview or detail sections.</w:t>
+      </w:r>
+    </w:p>
+    <w:p>
+      <w:pPr>
+        <w:pStyle w:val="ListBullet"/>
+      </w:pPr>
+      <w:r>
+        <w:t>Detail mode now focuses on top-level room sections and per-role costs. Remote CPU sections have been removed with the remote system.</w:t>
+      </w:r>
+    </w:p>
+    <w:p>
+      <w:pPr>
+        <w:pStyle w:val="ListBullet"/>
+      </w:pPr>
+      <w:r>
+        <w:t>Runtime pressure can still downgrade detail logging, stretch think intervals, and stretch construction cadence.</w:t>
+      </w:r>
+    </w:p>
+    <w:p>
+      <w:pPr>
+        <w:pStyle w:val="Heading1"/>
+      </w:pPr>
+      <w:r>
+        <w:t>Configuration</w:t>
+      </w:r>
+    </w:p>
+    <w:p>
+      <w:pPr>
+        <w:pStyle w:val="ListBullet"/>
+      </w:pPr>
+      <w:r>
+        <w:t>config.js is the main operator surface.</w:t>
+      </w:r>
+    </w:p>
+    <w:p>
+      <w:pPr>
+        <w:pStyle w:val="ListBullet"/>
+      </w:pPr>
+      <w:r>
+        <w:t>Use CREEPS for target counts and think intervals.</w:t>
+      </w:r>
+    </w:p>
+    <w:p>
+      <w:pPr>
+        <w:pStyle w:val="ListBullet"/>
+      </w:pPr>
+      <w:r>
+        <w:t>Use CONSTRUCTION for site caps, planner cadence, and future-infra placement hints.</w:t>
+      </w:r>
+    </w:p>
+    <w:p>
+      <w:pPr>
+        <w:pStyle w:val="ListBullet"/>
+      </w:pPr>
+      <w:r>
+        <w:t>Use LOGISTICS for tower refill thresholds.</w:t>
+      </w:r>
+    </w:p>
+    <w:p>
+      <w:pPr>
+        <w:pStyle w:val="ListBullet"/>
+      </w:pPr>
+      <w:r>
+        <w:t>Use DEFENSE for home-defense reaction tuning.</w:t>
+      </w:r>
+    </w:p>
+    <w:p>
+      <w:pPr>
+        <w:pStyle w:val="ListBullet"/>
+      </w:pPr>
+      <w:r>
+        <w:t>Use STATS for CPU console mode and runtime-pressure policy.</w:t>
+      </w:r>
+    </w:p>
+    <w:p>
+      <w:pPr>
+        <w:pStyle w:val="ListBullet"/>
+      </w:pPr>
+      <w:r>
+        <w:t>Use HUD and DIRECTIVES to control visibility and console noise.</w:t>
+      </w:r>
+    </w:p>
+    <w:p>
+      <w:pPr>
+        <w:pStyle w:val="Heading1"/>
+      </w:pPr>
+      <w:r>
+        <w:t>Memory And Cache Layout</w:t>
+      </w:r>
+    </w:p>
+    <w:p>
+      <w:pPr>
+        <w:pStyle w:val="ListBullet"/>
+      </w:pPr>
+      <w:r>
+        <w:t>Memory.stats stores CPU history, averages, max values, and runtime mode.</w:t>
+      </w:r>
+    </w:p>
+    <w:p>
+      <w:pPr>
+        <w:pStyle w:val="ListBullet"/>
+      </w:pPr>
+      <w:r>
+        <w:t>Memory.rooms[roomName].construction stores planner timing and the cached future plan.</w:t>
+      </w:r>
+    </w:p>
+    <w:p>
+      <w:pPr>
+        <w:pStyle w:val="ListBullet"/>
+      </w:pPr>
+      <w:r>
+        <w:t>Memory.rooms[roomName].spawnQueue stores the readable spawn queue snapshot.</w:t>
+      </w:r>
+    </w:p>
+    <w:p>
+      <w:pPr>
+        <w:pStyle w:val="ListBullet"/>
+      </w:pPr>
+      <w:r>
+        <w:t>Memory.rooms[roomName].defense.spawnLocks stores short-lived defense spawn anti-spam state.</w:t>
+      </w:r>
+    </w:p>
+    <w:p>
+      <w:pPr>
+        <w:pStyle w:val="ListBullet"/>
+      </w:pPr>
+      <w:r>
+        <w:t>utils.js keeps a tick-local room cache so managers and roles reuse the same room data.</w:t>
+      </w:r>
+    </w:p>
+    <w:p>
+      <w:pPr>
+        <w:pStyle w:val="Heading1"/>
+      </w:pPr>
+      <w:r>
+        <w:t>Practical Debug Order</w:t>
+      </w:r>
+    </w:p>
+    <w:p>
+      <w:pPr>
+        <w:pStyle w:val="ListBullet"/>
+      </w:pPr>
+      <w:r>
+        <w:t>Check room phase first.</w:t>
+      </w:r>
+    </w:p>
+    <w:p>
+      <w:pPr>
+        <w:pStyle w:val="ListBullet"/>
+      </w:pPr>
+      <w:r>
+        <w:t>Check buildStatus second.</w:t>
+      </w:r>
+    </w:p>
+    <w:p>
+      <w:pPr>
+        <w:pStyle w:val="ListBullet"/>
+      </w:pPr>
+      <w:r>
+        <w:t>Check the spawn queue written into room memory.</w:t>
+      </w:r>
+    </w:p>
+    <w:p>
+      <w:pPr>
+        <w:pStyle w:val="ListBullet"/>
+      </w:pPr>
+      <w:r>
+        <w:t>Check CPU runtime mode if behavior seems intentionally throttled.</w:t>
+      </w:r>
+    </w:p>
+    <w:p>
+      <w:pPr>
+        <w:pStyle w:val="ListBullet"/>
+      </w:pPr>
+      <w:r>
+        <w:t>Check the specific role logic only after the higher-level state looks correct.</w:t>
+      </w:r>
+    </w:p>
+    <w:p>
+      <w:pPr>
+        <w:pStyle w:val="Heading1"/>
+      </w:pPr>
+      <w:r>
+        <w:t>Quick File Map</w:t>
+      </w:r>
+    </w:p>
+    <w:tbl>
+      <w:tblPr>
+        <w:tblStyle w:val="TableGrid"/>
+        <w:tblW w:type="auto" w:w="0"/>
+        <w:jc w:val="center"/>
+        <w:tblLook w:firstColumn="1" w:firstRow="1" w:lastColumn="0" w:lastRow="0" w:noHBand="0" w:noVBand="1" w:val="04A0"/>
+      </w:tblPr>
+      <w:tblGrid>
+        <w:gridCol w:w="4968"/>
+        <w:gridCol w:w="4968"/>
+      </w:tblGrid>
+      <w:tr>
+        <w:tc>
+          <w:tcPr>
+            <w:tcW w:type="dxa" w:w="4968"/>
+          </w:tcPr>
+          <w:p>
+            <w:r>
+              <w:t>File group</w:t>
+            </w:r>
+          </w:p>
+        </w:tc>
+        <w:tc>
+          <w:tcPr>
+            <w:tcW w:type="dxa" w:w="4968"/>
+          </w:tcPr>
+          <w:p>
+            <w:r>
+              <w:t>Purpose</w:t>
             </w:r>
           </w:p>
         </w:tc>
@@ -970,65 +972,21 @@
       <w:tr>
         <w:tc>
           <w:tcPr>
-            <w:tcW w:type="dxa" w:w="4896"/>
+            <w:tcW w:type="dxa" w:w="4968"/>
           </w:tcPr>
           <w:p>
             <w:r>
-              <w:t>rangeddefender</w:t>
+              <w:t>dev/main.js and dev/kernel_*</w:t>
             </w:r>
           </w:p>
         </w:tc>
         <w:tc>
           <w:tcPr>
-            <w:tcW w:type="dxa" w:w="4896"/>
+            <w:tcW w:type="dxa" w:w="4968"/>
           </w:tcPr>
           <w:p>
             <w:r>
-              <w:t>Remote-room ranged defense role.</w:t>
-            </w:r>
-          </w:p>
-        </w:tc>
-      </w:tr>
-    </w:tbl>
-    <w:p/>
-    <w:p>
-      <w:pPr>
-        <w:pStyle w:val="IntenseQuote"/>
-      </w:pPr>
-      <w:r>
-        <w:t>Remote roles</w:t>
-      </w:r>
-    </w:p>
-    <w:tbl>
-      <w:tblPr>
-        <w:tblStyle w:val="TableGrid"/>
-        <w:tblW w:type="auto" w:w="0"/>
-        <w:tblLook w:firstColumn="1" w:firstRow="1" w:lastColumn="0" w:lastRow="0" w:noHBand="0" w:noVBand="1" w:val="04A0"/>
-      </w:tblPr>
-      <w:tblGrid>
-        <w:gridCol w:w="4896"/>
-        <w:gridCol w:w="4896"/>
-      </w:tblGrid>
-      <w:tr>
-        <w:tc>
-          <w:tcPr>
-            <w:tcW w:type="dxa" w:w="4896"/>
-            <w:shd w:fill="D9EAF7"/>
-          </w:tcPr>
-          <w:p>
-            <w:r>
-              <w:t>Area</w:t>
-            </w:r>
-          </w:p>
-        </w:tc>
-        <w:tc>
-          <w:tcPr>
-            <w:tcW w:type="dxa" w:w="4896"/>
-            <w:shd w:fill="D9EAF7"/>
-          </w:tcPr>
-          <w:p>
-            <w:r>
-              <w:t>Details</w:t>
+              <w:t>Top-level tick flow, memory cleanup, profiler, and CPU snapshot handling.</w:t>
             </w:r>
           </w:p>
         </w:tc>
@@ -1036,21 +994,21 @@
       <w:tr>
         <w:tc>
           <w:tcPr>
-            <w:tcW w:type="dxa" w:w="4896"/>
+            <w:tcW w:type="dxa" w:w="4968"/>
           </w:tcPr>
           <w:p>
             <w:r>
-              <w:t>remotejrworker</w:t>
+              <w:t>dev/room_manager.js and dev/room_state.js</w:t>
             </w:r>
           </w:p>
         </w:tc>
         <w:tc>
           <w:tcPr>
-            <w:tcW w:type="dxa" w:w="4896"/>
+            <w:tcW w:type="dxa" w:w="4968"/>
           </w:tcPr>
           <w:p>
             <w:r>
-              <w:t>Phase 1 remote bootstrap role.</w:t>
+              <w:t>Home-room orchestration and shared state collection.</w:t>
             </w:r>
           </w:p>
         </w:tc>
@@ -1058,21 +1016,21 @@
       <w:tr>
         <w:tc>
           <w:tcPr>
-            <w:tcW w:type="dxa" w:w="4896"/>
+            <w:tcW w:type="dxa" w:w="4968"/>
           </w:tcPr>
           <w:p>
             <w:r>
-              <w:t>remoteworker</w:t>
+              <w:t>dev/construction_* and dev/stamp_library.js</w:t>
             </w:r>
           </w:p>
         </w:tc>
         <w:tc>
           <w:tcPr>
-            <w:tcW w:type="dxa" w:w="4896"/>
+            <w:tcW w:type="dxa" w:w="4968"/>
           </w:tcPr>
           <w:p>
             <w:r>
-              <w:t>Remote infrastructure builder / transition role.</w:t>
+              <w:t>Roadmap intent, build status, site placement, and stamped layout helpers.</w:t>
             </w:r>
           </w:p>
         </w:tc>
@@ -1080,21 +1038,21 @@
       <w:tr>
         <w:tc>
           <w:tcPr>
-            <w:tcW w:type="dxa" w:w="4896"/>
+            <w:tcW w:type="dxa" w:w="4968"/>
           </w:tcPr>
           <w:p>
             <w:r>
-              <w:t>remoteminer</w:t>
+              <w:t>dev/spawn_manager.js and dev/bodies.js</w:t>
             </w:r>
           </w:p>
         </w:tc>
         <w:tc>
           <w:tcPr>
-            <w:tcW w:type="dxa" w:w="4896"/>
+            <w:tcW w:type="dxa" w:w="4968"/>
           </w:tcPr>
           <w:p>
             <w:r>
-              <w:t>Remote dedicated source harvesting.</w:t>
+              <w:t>Spawn queue building and body selection.</w:t>
             </w:r>
           </w:p>
         </w:tc>
@@ -1102,21 +1060,21 @@
       <w:tr>
         <w:tc>
           <w:tcPr>
-            <w:tcW w:type="dxa" w:w="4896"/>
+            <w:tcW w:type="dxa" w:w="4968"/>
           </w:tcPr>
           <w:p>
             <w:r>
-              <w:t>remotehauler</w:t>
+              <w:t>dev/creep_manager.js and dev/role_*.js</w:t>
             </w:r>
           </w:p>
         </w:tc>
         <w:tc>
           <w:tcPr>
-            <w:tcW w:type="dxa" w:w="4896"/>
+            <w:tcW w:type="dxa" w:w="4968"/>
           </w:tcPr>
           <w:p>
             <w:r>
-              <w:t>Remote energy haulback role.</w:t>
+              <w:t>Role dispatch and per-role behavior.</w:t>
             </w:r>
           </w:p>
         </w:tc>
@@ -1124,33 +1082,120 @@
       <w:tr>
         <w:tc>
           <w:tcPr>
-            <w:tcW w:type="dxa" w:w="4896"/>
+            <w:tcW w:type="dxa" w:w="4968"/>
           </w:tcPr>
           <w:p>
             <w:r>
-              <w:t>reserver</w:t>
+              <w:t>dev/logistics_manager.js</w:t>
             </w:r>
           </w:p>
         </w:tc>
         <w:tc>
           <w:tcPr>
-            <w:tcW w:type="dxa" w:w="4896"/>
+            <w:tcW w:type="dxa" w:w="4968"/>
           </w:tcPr>
           <w:p>
             <w:r>
-              <w:t>Reservation upkeep for configured remotes.</w:t>
+              <w:t>Shared room energy policy.</w:t>
+            </w:r>
+          </w:p>
+        </w:tc>
+      </w:tr>
+      <w:tr>
+        <w:tc>
+          <w:tcPr>
+            <w:tcW w:type="dxa" w:w="4968"/>
+          </w:tcPr>
+          <w:p>
+            <w:r>
+              <w:t>dev/defense_manager.js and dev/tower_manager.js</w:t>
+            </w:r>
+          </w:p>
+        </w:tc>
+        <w:tc>
+          <w:tcPr>
+            <w:tcW w:type="dxa" w:w="4968"/>
+          </w:tcPr>
+          <w:p>
+            <w:r>
+              <w:t>Home defense planning and tower behavior.</w:t>
+            </w:r>
+          </w:p>
+        </w:tc>
+      </w:tr>
+      <w:tr>
+        <w:tc>
+          <w:tcPr>
+            <w:tcW w:type="dxa" w:w="4968"/>
+          </w:tcPr>
+          <w:p>
+            <w:r>
+              <w:t>dev/hud.js and dev/directive_manager.js</w:t>
+            </w:r>
+          </w:p>
+        </w:tc>
+        <w:tc>
+          <w:tcPr>
+            <w:tcW w:type="dxa" w:w="4968"/>
+          </w:tcPr>
+          <w:p>
+            <w:r>
+              <w:t>On-map HUD, creep labels, and room console reporting.</w:t>
+            </w:r>
+          </w:p>
+        </w:tc>
+      </w:tr>
+      <w:tr>
+        <w:tc>
+          <w:tcPr>
+            <w:tcW w:type="dxa" w:w="4968"/>
+          </w:tcPr>
+          <w:p>
+            <w:r>
+              <w:t>dev/stats_manager.js</w:t>
+            </w:r>
+          </w:p>
+        </w:tc>
+        <w:tc>
+          <w:tcPr>
+            <w:tcW w:type="dxa" w:w="4968"/>
+          </w:tcPr>
+          <w:p>
+            <w:r>
+              <w:t>CPU history, reporting, and runtime pressure behavior.</w:t>
+            </w:r>
+          </w:p>
+        </w:tc>
+      </w:tr>
+      <w:tr>
+        <w:tc>
+          <w:tcPr>
+            <w:tcW w:type="dxa" w:w="4968"/>
+          </w:tcPr>
+          <w:p>
+            <w:r>
+              <w:t>dev/config.js</w:t>
+            </w:r>
+          </w:p>
+        </w:tc>
+        <w:tc>
+          <w:tcPr>
+            <w:tcW w:type="dxa" w:w="4968"/>
+          </w:tcPr>
+          <w:p>
+            <w:r>
+              <w:t>Operator settings.</w:t>
             </w:r>
           </w:p>
         </w:tc>
       </w:tr>
     </w:tbl>
-    <w:p/>
     <w:p>
       <w:pPr>
         <w:pStyle w:val="Heading1"/>
       </w:pPr>
       <w:r>
-        <w:t>6. Logistics, Defense, And Towers</w:t>
+        <w:t>Extension Rules</w:t>
       </w:r>
     </w:p>
     <w:p>
@@ -1158,7 +1203,7 @@
         <w:pStyle w:val="ListBullet"/>
       </w:pPr>
       <w:r>
-        <w:t>logistics_manager.js centralizes shared withdrawal and delivery rules so worker and hauler behavior stays consistent.</w:t>
+        <w:t>Keep changes narrow and phase-driven.</w:t>
       </w:r>
     </w:p>
     <w:p>
@@ -1166,7 +1211,7 @@
         <w:pStyle w:val="ListBullet"/>
       </w:pPr>
       <w:r>
-        <w:t>defense_manager.js evaluates home and remote threats, classifies the threat type, and requests the correct defensive response role.</w:t>
+        <w:t>If a new feature is tunable, prefer adding config before hardcoding behavior.</w:t>
       </w:r>
     </w:p>
     <w:p>
@@ -1174,7 +1219,7 @@
         <w:pStyle w:val="ListBullet"/>
       </w:pPr>
       <w:r>
-        <w:t>tower_manager.js keeps tower attack, heal, and repair behavior narrow and cheap.</w:t>
+        <w:t>If a new structure type is added, update roadmap, status, planner, HUD, directives, and config notes together.</w:t>
       </w:r>
     </w:p>
     <w:p>
@@ -1182,968 +1227,37 @@
         <w:pStyle w:val="ListBullet"/>
       </w:pPr>
       <w:r>
-        <w:t>Civilian retreat behavior is enforced in creep_manager.js so non-defense creeps yield to active defense state before running their normal role logic.</w:t>
-      </w:r>
-    </w:p>
-    <w:p>
-      <w:pPr>
-        <w:pStyle w:val="ListBullet"/>
-      </w:pPr>
-      <w:r>
-        <w:t>Remote threat state can remain latched from cached hostile intel until a visible scan clears the room.</w:t>
-      </w:r>
-    </w:p>
-    <w:p>
-      <w:pPr>
-        <w:pStyle w:val="Heading1"/>
-      </w:pPr>
-      <w:r>
-        <w:t>7. Remote Mining</w:t>
-      </w:r>
-    </w:p>
-    <w:p>
-      <w:pPr>
-        <w:pStyle w:val="ListBullet"/>
-      </w:pPr>
-      <w:r>
-        <w:t>remote_manager.js is the main remote-control file. It normalizes remote configuration, caches remote intel, schedules scans, and exposes remote plan summaries.</w:t>
-      </w:r>
-    </w:p>
-    <w:p>
-      <w:pPr>
-        <w:pStyle w:val="ListBullet"/>
-      </w:pPr>
-      <w:r>
-        <w:t>Configured remotes live in config.js under REMOTE_MINING.SITES.</w:t>
-      </w:r>
-    </w:p>
-    <w:p>
-      <w:pPr>
-        <w:pStyle w:val="ListBullet"/>
-      </w:pPr>
-      <w:r>
-        <w:t>Remote scans are budgeted. Visible, hot, or defended remotes refresh more often; quiet remotes can reuse cached intel for many ticks.</w:t>
-      </w:r>
-    </w:p>
-    <w:p>
-      <w:pPr>
-        <w:pStyle w:val="ListBullet"/>
-      </w:pPr>
-      <w:r>
-        <w:t>Remote construction planning only handles the narrow current scope: source containers and roads for configured remotes that are ready for phase two infrastructure.</w:t>
-      </w:r>
-    </w:p>
-    <w:p>
-      <w:pPr>
-        <w:pStyle w:val="Heading1"/>
-      </w:pPr>
-      <w:r>
-        <w:t>8. HUD And Developer Visibility</w:t>
-      </w:r>
-    </w:p>
-    <w:p>
-      <w:pPr>
-        <w:pStyle w:val="ListBullet"/>
-      </w:pPr>
-      <w:r>
-        <w:t>hud.js draws two main home-room panels: top-left for home-room status and top-right for remote summary blocks.</w:t>
-      </w:r>
-    </w:p>
-    <w:p>
-      <w:pPr>
-        <w:pStyle w:val="ListBullet"/>
-      </w:pPr>
-      <w:r>
-        <w:t>The home panel shows only home-room details. Remote creep counts were intentionally removed from the home role line to make quick scanning easier.</w:t>
-      </w:r>
-    </w:p>
-    <w:p>
-      <w:pPr>
-        <w:pStyle w:val="ListBullet"/>
-      </w:pPr>
-      <w:r>
-        <w:t>The construction checklist now includes roadmap phase, future-plan readiness, and advanced structure progress.</w:t>
-      </w:r>
-    </w:p>
-    <w:p>
-      <w:pPr>
-        <w:pStyle w:val="ListBullet"/>
-      </w:pPr>
-      <w:r>
-        <w:t>Visible remote-room HUDs use the same remote summary layout as the top-right home-room remote panel.</w:t>
-      </w:r>
-    </w:p>
-    <w:p>
-      <w:pPr>
-        <w:pStyle w:val="ListBullet"/>
-      </w:pPr>
-      <w:r>
-        <w:t>stats_manager.js and kernel_profiler.js provide the CPU breakdown needed to find high-cost sections without leaving detailed instrumentation enabled all the time.</w:t>
-      </w:r>
-    </w:p>
-    <w:p>
-      <w:pPr>
-        <w:pStyle w:val="IntenseQuote"/>
-      </w:pPr>
-      <w:r>
-        <w:t>HUD config quick reference</w:t>
-      </w:r>
-    </w:p>
-    <w:tbl>
-      <w:tblPr>
-        <w:tblStyle w:val="TableGrid"/>
-        <w:tblW w:type="auto" w:w="0"/>
-        <w:tblLook w:firstColumn="1" w:firstRow="1" w:lastColumn="0" w:lastRow="0" w:noHBand="0" w:noVBand="1" w:val="04A0"/>
-      </w:tblPr>
-      <w:tblGrid>
-        <w:gridCol w:w="4896"/>
-        <w:gridCol w:w="4896"/>
-      </w:tblGrid>
-      <w:tr>
-        <w:tc>
-          <w:tcPr>
-            <w:tcW w:type="dxa" w:w="4896"/>
-            <w:shd w:fill="D9EAF7"/>
-          </w:tcPr>
-          <w:p>
-            <w:r>
-              <w:t>Area</w:t>
-            </w:r>
-          </w:p>
-        </w:tc>
-        <w:tc>
-          <w:tcPr>
-            <w:tcW w:type="dxa" w:w="4896"/>
-            <w:shd w:fill="D9EAF7"/>
-          </w:tcPr>
-          <w:p>
-            <w:r>
-              <w:t>Details</w:t>
-            </w:r>
-          </w:p>
-        </w:tc>
-      </w:tr>
-      <w:tr>
-        <w:tc>
-          <w:tcPr>
-            <w:tcW w:type="dxa" w:w="4896"/>
-          </w:tcPr>
-          <w:p>
-            <w:r>
-              <w:t>HUD.ENABLED</w:t>
-            </w:r>
-          </w:p>
-        </w:tc>
-        <w:tc>
-          <w:tcPr>
-            <w:tcW w:type="dxa" w:w="4896"/>
-          </w:tcPr>
-          <w:p>
-            <w:r>
-              <w:t>Master HUD toggle.</w:t>
-            </w:r>
-          </w:p>
-        </w:tc>
-      </w:tr>
-      <w:tr>
-        <w:tc>
-          <w:tcPr>
-            <w:tcW w:type="dxa" w:w="4896"/>
-          </w:tcPr>
-          <w:p>
-            <w:r>
-              <w:t>HUD.CREEP_LABELS</w:t>
-            </w:r>
-          </w:p>
-        </w:tc>
-        <w:tc>
-          <w:tcPr>
-            <w:tcW w:type="dxa" w:w="4896"/>
-          </w:tcPr>
-          <w:p>
-            <w:r>
-              <w:t>Enables creep labels in home and visible remote rooms.</w:t>
-            </w:r>
-          </w:p>
-        </w:tc>
-      </w:tr>
-      <w:tr>
-        <w:tc>
-          <w:tcPr>
-            <w:tcW w:type="dxa" w:w="4896"/>
-          </w:tcPr>
-          <w:p>
-            <w:r>
-              <w:t>HUD.LABEL_INTERVAL</w:t>
-            </w:r>
-          </w:p>
-        </w:tc>
-        <w:tc>
-          <w:tcPr>
-            <w:tcW w:type="dxa" w:w="4896"/>
-          </w:tcPr>
-          <w:p>
-            <w:r>
-              <w:t>How often creep labels redraw.</w:t>
-            </w:r>
-          </w:p>
-        </w:tc>
-      </w:tr>
-      <w:tr>
-        <w:tc>
-          <w:tcPr>
-            <w:tcW w:type="dxa" w:w="4896"/>
-          </w:tcPr>
-          <w:p>
-            <w:r>
-              <w:t>HUD.CONSOLE_INTERVAL</w:t>
-            </w:r>
-          </w:p>
-        </w:tc>
-        <w:tc>
-          <w:tcPr>
-            <w:tcW w:type="dxa" w:w="4896"/>
-          </w:tcPr>
-          <w:p>
-            <w:r>
-              <w:t>How often console room summary lines print.</w:t>
-            </w:r>
-          </w:p>
-        </w:tc>
-      </w:tr>
-      <w:tr>
-        <w:tc>
-          <w:tcPr>
-            <w:tcW w:type="dxa" w:w="4896"/>
-          </w:tcPr>
-          <w:p>
-            <w:r>
-              <w:t>HUD.SHOW_PERFORMANCE</w:t>
-            </w:r>
-          </w:p>
-        </w:tc>
-        <w:tc>
-          <w:tcPr>
-            <w:tcW w:type="dxa" w:w="4896"/>
-          </w:tcPr>
-          <w:p>
-            <w:r>
-              <w:t>Shows CPU and bucket line in the home panel.</w:t>
-            </w:r>
-          </w:p>
-        </w:tc>
-      </w:tr>
-      <w:tr>
-        <w:tc>
-          <w:tcPr>
-            <w:tcW w:type="dxa" w:w="4896"/>
-          </w:tcPr>
-          <w:p>
-            <w:r>
-              <w:t>HUD.SHOW_CONSTRUCTION_CHECKLIST</w:t>
-            </w:r>
-          </w:p>
-        </w:tc>
-        <w:tc>
-          <w:tcPr>
-            <w:tcW w:type="dxa" w:w="4896"/>
-          </w:tcPr>
-          <w:p>
-            <w:r>
-              <w:t>Shows roadmap/build progress in the home panel.</w:t>
-            </w:r>
-          </w:p>
-        </w:tc>
-      </w:tr>
-      <w:tr>
-        <w:tc>
-          <w:tcPr>
-            <w:tcW w:type="dxa" w:w="4896"/>
-          </w:tcPr>
-          <w:p>
-            <w:r>
-              <w:t>HUD.CONSTRUCTION_CHECKLIST_MODE</w:t>
-            </w:r>
-          </w:p>
-        </w:tc>
-        <w:tc>
-          <w:tcPr>
-            <w:tcW w:type="dxa" w:w="4896"/>
-          </w:tcPr>
-          <w:p>
-            <w:r>
-              <w:t>compact or detailed construction block.</w:t>
-            </w:r>
-          </w:p>
-        </w:tc>
-      </w:tr>
-      <w:tr>
-        <w:tc>
-          <w:tcPr>
-            <w:tcW w:type="dxa" w:w="4896"/>
-          </w:tcPr>
-          <w:p>
-            <w:r>
-              <w:t>HUD.SHOW_REMOTE_SITES</w:t>
-            </w:r>
-          </w:p>
-        </w:tc>
-        <w:tc>
-          <w:tcPr>
-            <w:tcW w:type="dxa" w:w="4896"/>
-          </w:tcPr>
-          <w:p>
-            <w:r>
-              <w:t>Enables top-right remote summary blocks and visible remote overlays.</w:t>
-            </w:r>
-          </w:p>
-        </w:tc>
-      </w:tr>
-      <w:tr>
-        <w:tc>
-          <w:tcPr>
-            <w:tcW w:type="dxa" w:w="4896"/>
-          </w:tcPr>
-          <w:p>
-            <w:r>
-              <w:t>HUD.REMOTE_SITE_MODE</w:t>
-            </w:r>
-          </w:p>
-        </w:tc>
-        <w:tc>
-          <w:tcPr>
-            <w:tcW w:type="dxa" w:w="4896"/>
-          </w:tcPr>
-          <w:p>
-            <w:r>
-              <w:t>compact or detailed remote summary view.</w:t>
-            </w:r>
-          </w:p>
-        </w:tc>
-      </w:tr>
-    </w:tbl>
-    <w:p/>
-    <w:p>
-      <w:pPr>
-        <w:pStyle w:val="Heading1"/>
-      </w:pPr>
-      <w:r>
-        <w:t>9. Config And Operator Workflow</w:t>
-      </w:r>
-    </w:p>
-    <w:p>
-      <w:pPr>
-        <w:pStyle w:val="ListBullet"/>
-      </w:pPr>
-      <w:r>
-        <w:t>config.js is the main operator surface. If behavior should be tunable without rewriting logic, it belongs there.</w:t>
-      </w:r>
-    </w:p>
-    <w:p>
-      <w:pPr>
-        <w:pStyle w:val="ListBullet"/>
-      </w:pPr>
-      <w:r>
-        <w:t>Preferred workflow: check config values first, then room phase, then buildStatus, then spawn queue, then deeper manager or role behavior.</w:t>
-      </w:r>
-    </w:p>
-    <w:p>
-      <w:pPr>
-        <w:pStyle w:val="ListBullet"/>
-      </w:pPr>
-      <w:r>
-        <w:t>Remote room setup, CPU console modes, construction cadence, defense tuning, creep counts, and HUD behavior are all configured from config.js.</w:t>
-      </w:r>
-    </w:p>
-    <w:p>
-      <w:pPr>
-        <w:pStyle w:val="IntenseQuote"/>
-      </w:pPr>
-      <w:r>
-        <w:t>Primary config sections</w:t>
-      </w:r>
-    </w:p>
-    <w:tbl>
-      <w:tblPr>
-        <w:tblStyle w:val="TableGrid"/>
-        <w:tblW w:type="auto" w:w="0"/>
-        <w:tblLook w:firstColumn="1" w:firstRow="1" w:lastColumn="0" w:lastRow="0" w:noHBand="0" w:noVBand="1" w:val="04A0"/>
-      </w:tblPr>
-      <w:tblGrid>
-        <w:gridCol w:w="4896"/>
-        <w:gridCol w:w="4896"/>
-      </w:tblGrid>
-      <w:tr>
-        <w:tc>
-          <w:tcPr>
-            <w:tcW w:type="dxa" w:w="4896"/>
-            <w:shd w:fill="D9EAF7"/>
-          </w:tcPr>
-          <w:p>
-            <w:r>
-              <w:t>Area</w:t>
-            </w:r>
-          </w:p>
-        </w:tc>
-        <w:tc>
-          <w:tcPr>
-            <w:tcW w:type="dxa" w:w="4896"/>
-            <w:shd w:fill="D9EAF7"/>
-          </w:tcPr>
-          <w:p>
-            <w:r>
-              <w:t>Details</w:t>
-            </w:r>
-          </w:p>
-        </w:tc>
-      </w:tr>
-      <w:tr>
-        <w:tc>
-          <w:tcPr>
-            <w:tcW w:type="dxa" w:w="4896"/>
-          </w:tcPr>
-          <w:p>
-            <w:r>
-              <w:t>CREEPS</w:t>
-            </w:r>
-          </w:p>
-        </w:tc>
-        <w:tc>
-          <w:tcPr>
-            <w:tcW w:type="dxa" w:w="4896"/>
-          </w:tcPr>
-          <w:p>
-            <w:r>
-              <w:t>Target counts and think-interval settings.</w:t>
-            </w:r>
-          </w:p>
-        </w:tc>
-      </w:tr>
-      <w:tr>
-        <w:tc>
-          <w:tcPr>
-            <w:tcW w:type="dxa" w:w="4896"/>
-          </w:tcPr>
-          <w:p>
-            <w:r>
-              <w:t>CONSTRUCTION</w:t>
-            </w:r>
-          </w:p>
-        </w:tc>
-        <w:tc>
-          <w:tcPr>
-            <w:tcW w:type="dxa" w:w="4896"/>
-          </w:tcPr>
-          <w:p>
-            <w:r>
-              <w:t>Site caps, planning cadence, advanced plan cache settings, and future infrastructure ranges.</w:t>
-            </w:r>
-          </w:p>
-        </w:tc>
-      </w:tr>
-      <w:tr>
-        <w:tc>
-          <w:tcPr>
-            <w:tcW w:type="dxa" w:w="4896"/>
-          </w:tcPr>
-          <w:p>
-            <w:r>
-              <w:t>LOGISTICS</w:t>
-            </w:r>
-          </w:p>
-        </w:tc>
-        <w:tc>
-          <w:tcPr>
-            <w:tcW w:type="dxa" w:w="4896"/>
-          </w:tcPr>
-          <w:p>
-            <w:r>
-              <w:t>Controller container reserve and tower refill thresholds.</w:t>
-            </w:r>
-          </w:p>
-        </w:tc>
-      </w:tr>
-      <w:tr>
-        <w:tc>
-          <w:tcPr>
-            <w:tcW w:type="dxa" w:w="4896"/>
-          </w:tcPr>
-          <w:p>
-            <w:r>
-              <w:t>DEFENSE</w:t>
-            </w:r>
-          </w:p>
-        </w:tc>
-        <w:tc>
-          <w:tcPr>
-            <w:tcW w:type="dxa" w:w="4896"/>
-          </w:tcPr>
-          <w:p>
-            <w:r>
-              <w:t>Perimeter sizing, tower policy, and reactive defense escalation settings.</w:t>
-            </w:r>
-          </w:p>
-        </w:tc>
-      </w:tr>
-      <w:tr>
-        <w:tc>
-          <w:tcPr>
-            <w:tcW w:type="dxa" w:w="4896"/>
-          </w:tcPr>
-          <w:p>
-            <w:r>
-              <w:t>STATS</w:t>
-            </w:r>
-          </w:p>
-        </w:tc>
-        <w:tc>
-          <w:tcPr>
-            <w:tcW w:type="dxa" w:w="4896"/>
-          </w:tcPr>
-          <w:p>
-            <w:r>
-              <w:t>CPU console mode, print interval, and runtime pressure rules.</w:t>
-            </w:r>
-          </w:p>
-        </w:tc>
-      </w:tr>
-      <w:tr>
-        <w:tc>
-          <w:tcPr>
-            <w:tcW w:type="dxa" w:w="4896"/>
-          </w:tcPr>
-          <w:p>
-            <w:r>
-              <w:t>REMOTE_MINING</w:t>
-            </w:r>
-          </w:p>
-        </w:tc>
-        <w:tc>
-          <w:tcPr>
-            <w:tcW w:type="dxa" w:w="4896"/>
-          </w:tcPr>
-          <w:p>
-            <w:r>
-              <w:t>Remote enable flag, scheduler, scaling hooks, and remote site definitions.</w:t>
-            </w:r>
-          </w:p>
-        </w:tc>
-      </w:tr>
-    </w:tbl>
-    <w:p/>
-    <w:p>
-      <w:pPr>
-        <w:pStyle w:val="Heading1"/>
-      </w:pPr>
-      <w:r>
-        <w:t>10. Memory And Cache Layout</w:t>
-      </w:r>
-    </w:p>
-    <w:p>
-      <w:pPr>
-        <w:pStyle w:val="ListBullet"/>
-      </w:pPr>
-      <w:r>
-        <w:t>Memory.stats stores CPU history, averages, max values, and runtime pressure mode.</w:t>
-      </w:r>
-    </w:p>
-    <w:p>
-      <w:pPr>
-        <w:pStyle w:val="ListBullet"/>
-      </w:pPr>
-      <w:r>
-        <w:t>Memory.rooms[roomName].construction stores plan timing and the cached future plan for advanced structures.</w:t>
-      </w:r>
-    </w:p>
-    <w:p>
-      <w:pPr>
-        <w:pStyle w:val="ListBullet"/>
-      </w:pPr>
-      <w:r>
-        <w:t>Memory.rooms[targetRoom].remoteIntel stores cached remote visibility, progress, and hostile summary data.</w:t>
-      </w:r>
-    </w:p>
-    <w:p>
-      <w:pPr>
-        <w:pStyle w:val="ListBullet"/>
-      </w:pPr>
-      <w:r>
-        <w:t>Room runtime cache in utils.js is used to avoid repeated same-tick scans inside one room execution path.</w:t>
-      </w:r>
-    </w:p>
-    <w:p>
-      <w:pPr>
-        <w:pStyle w:val="Heading1"/>
-      </w:pPr>
-      <w:r>
-        <w:t>11. Safe Extension Guidelines</w:t>
-      </w:r>
-    </w:p>
-    <w:p>
-      <w:pPr>
-        <w:pStyle w:val="ListBullet"/>
-      </w:pPr>
-      <w:r>
-        <w:t>Keep changes narrow. This codebase is deliberately split into small managers so one subsystem can evolve without rewriting the whole bot.</w:t>
-      </w:r>
-    </w:p>
-    <w:p>
-      <w:pPr>
-        <w:pStyle w:val="ListBullet"/>
-      </w:pPr>
-      <w:r>
-        <w:t>Do not add expensive all-room or all-creep scans to HUD, construction, or remote logic unless they are strongly cached.</w:t>
-      </w:r>
-    </w:p>
-    <w:p>
-      <w:pPr>
-        <w:pStyle w:val="ListBullet"/>
-      </w:pPr>
-      <w:r>
-        <w:t>If adding a new structure class, update the roadmap, status counters, planner action switch, HUD status view, and any relevant config notes together.</w:t>
-      </w:r>
-    </w:p>
-    <w:p>
-      <w:pPr>
-        <w:pStyle w:val="ListBullet"/>
-      </w:pPr>
-      <w:r>
-        <w:t>If adding a new role, update bodies.js, creep_manager.js, spawn_manager.js, HUD role labels, and any relevant defense/remote assignment maps together.</w:t>
-      </w:r>
-    </w:p>
-    <w:p>
-      <w:pPr>
-        <w:pStyle w:val="ListBullet"/>
-      </w:pPr>
-      <w:r>
-        <w:t>When debugging CPU, use STATS.CPU_CONSOLE_MODE detail briefly, then return to overview or off for normal runtime.</w:t>
-      </w:r>
-    </w:p>
-    <w:p>
-      <w:pPr>
-        <w:pStyle w:val="Heading1"/>
-      </w:pPr>
-      <w:r>
-        <w:t>12. Quick File Map By Subsystem</w:t>
-      </w:r>
-    </w:p>
-    <w:p>
-      <w:pPr>
-        <w:pStyle w:val="IntenseQuote"/>
-      </w:pPr>
-      <w:r>
-        <w:t>Subsystem file map</w:t>
-      </w:r>
-    </w:p>
-    <w:tbl>
-      <w:tblPr>
-        <w:tblStyle w:val="TableGrid"/>
-        <w:tblW w:type="auto" w:w="0"/>
-        <w:tblLook w:firstColumn="1" w:firstRow="1" w:lastColumn="0" w:lastRow="0" w:noHBand="0" w:noVBand="1" w:val="04A0"/>
-      </w:tblPr>
-      <w:tblGrid>
-        <w:gridCol w:w="4896"/>
-        <w:gridCol w:w="4896"/>
-      </w:tblGrid>
-      <w:tr>
-        <w:tc>
-          <w:tcPr>
-            <w:tcW w:type="dxa" w:w="4896"/>
-            <w:shd w:fill="D9EAF7"/>
-          </w:tcPr>
-          <w:p>
-            <w:r>
-              <w:t>Area</w:t>
-            </w:r>
-          </w:p>
-        </w:tc>
-        <w:tc>
-          <w:tcPr>
-            <w:tcW w:type="dxa" w:w="4896"/>
-            <w:shd w:fill="D9EAF7"/>
-          </w:tcPr>
-          <w:p>
-            <w:r>
-              <w:t>Details</w:t>
-            </w:r>
-          </w:p>
-        </w:tc>
-      </w:tr>
-      <w:tr>
-        <w:tc>
-          <w:tcPr>
-            <w:tcW w:type="dxa" w:w="4896"/>
-          </w:tcPr>
-          <w:p>
-            <w:r>
-              <w:t>Kernel</w:t>
-            </w:r>
-          </w:p>
-        </w:tc>
-        <w:tc>
-          <w:tcPr>
-            <w:tcW w:type="dxa" w:w="4896"/>
-          </w:tcPr>
-          <w:p>
-            <w:r>
-              <w:t>main.js, kernel_loop.js, kernel_memory.js, kernel_profiler.js</w:t>
-            </w:r>
-          </w:p>
-        </w:tc>
-      </w:tr>
-      <w:tr>
-        <w:tc>
-          <w:tcPr>
-            <w:tcW w:type="dxa" w:w="4896"/>
-          </w:tcPr>
-          <w:p>
-            <w:r>
-              <w:t>Room orchestration</w:t>
-            </w:r>
-          </w:p>
-        </w:tc>
-        <w:tc>
-          <w:tcPr>
-            <w:tcW w:type="dxa" w:w="4896"/>
-          </w:tcPr>
-          <w:p>
-            <w:r>
-              <w:t>room_manager.js, room_state.js</w:t>
-            </w:r>
-          </w:p>
-        </w:tc>
-      </w:tr>
-      <w:tr>
-        <w:tc>
-          <w:tcPr>
-            <w:tcW w:type="dxa" w:w="4896"/>
-          </w:tcPr>
-          <w:p>
-            <w:r>
-              <w:t>Construction</w:t>
-            </w:r>
-          </w:p>
-        </w:tc>
-        <w:tc>
-          <w:tcPr>
-            <w:tcW w:type="dxa" w:w="4896"/>
-          </w:tcPr>
-          <w:p>
-            <w:r>
-              <w:t>construction_roadmap.js, construction_status.js, construction_manager.js, stamp_library.js</w:t>
-            </w:r>
-          </w:p>
-        </w:tc>
-      </w:tr>
-      <w:tr>
-        <w:tc>
-          <w:tcPr>
-            <w:tcW w:type="dxa" w:w="4896"/>
-          </w:tcPr>
-          <w:p>
-            <w:r>
-              <w:t>Spawning and bodies</w:t>
-            </w:r>
-          </w:p>
-        </w:tc>
-        <w:tc>
-          <w:tcPr>
-            <w:tcW w:type="dxa" w:w="4896"/>
-          </w:tcPr>
-          <w:p>
-            <w:r>
-              <w:t>spawn_manager.js, bodies.js</w:t>
-            </w:r>
-          </w:p>
-        </w:tc>
-      </w:tr>
-      <w:tr>
-        <w:tc>
-          <w:tcPr>
-            <w:tcW w:type="dxa" w:w="4896"/>
-          </w:tcPr>
-          <w:p>
-            <w:r>
-              <w:t>Roles</w:t>
-            </w:r>
-          </w:p>
-        </w:tc>
-        <w:tc>
-          <w:tcPr>
-            <w:tcW w:type="dxa" w:w="4896"/>
-          </w:tcPr>
-          <w:p>
-            <w:r>
-              <w:t>creep_manager.js and role_*.js files</w:t>
-            </w:r>
-          </w:p>
-        </w:tc>
-      </w:tr>
-      <w:tr>
-        <w:tc>
-          <w:tcPr>
-            <w:tcW w:type="dxa" w:w="4896"/>
-          </w:tcPr>
-          <w:p>
-            <w:r>
-              <w:t>Defense</w:t>
-            </w:r>
-          </w:p>
-        </w:tc>
-        <w:tc>
-          <w:tcPr>
-            <w:tcW w:type="dxa" w:w="4896"/>
-          </w:tcPr>
-          <w:p>
-            <w:r>
-              <w:t>defense_manager.js, tower_manager.js, role_defender.js, role_ranged_defender.js</w:t>
-            </w:r>
-          </w:p>
-        </w:tc>
-      </w:tr>
-      <w:tr>
-        <w:tc>
-          <w:tcPr>
-            <w:tcW w:type="dxa" w:w="4896"/>
-          </w:tcPr>
-          <w:p>
-            <w:r>
-              <w:t>Remote mining</w:t>
-            </w:r>
-          </w:p>
-        </w:tc>
-        <w:tc>
-          <w:tcPr>
-            <w:tcW w:type="dxa" w:w="4896"/>
-          </w:tcPr>
-          <w:p>
-            <w:r>
-              <w:t>remote_manager.js, remote role files, reserver role</w:t>
-            </w:r>
-          </w:p>
-        </w:tc>
-      </w:tr>
-      <w:tr>
-        <w:tc>
-          <w:tcPr>
-            <w:tcW w:type="dxa" w:w="4896"/>
-          </w:tcPr>
-          <w:p>
-            <w:r>
-              <w:t>Visibility and reporting</w:t>
-            </w:r>
-          </w:p>
-        </w:tc>
-        <w:tc>
-          <w:tcPr>
-            <w:tcW w:type="dxa" w:w="4896"/>
-          </w:tcPr>
-          <w:p>
-            <w:r>
-              <w:t>hud.js, directive_manager.js, stats_manager.js</w:t>
-            </w:r>
-          </w:p>
-        </w:tc>
-      </w:tr>
-      <w:tr>
-        <w:tc>
-          <w:tcPr>
-            <w:tcW w:type="dxa" w:w="4896"/>
-          </w:tcPr>
-          <w:p>
-            <w:r>
-              <w:t>Shared helpers</w:t>
-            </w:r>
-          </w:p>
-        </w:tc>
-        <w:tc>
-          <w:tcPr>
-            <w:tcW w:type="dxa" w:w="4896"/>
-          </w:tcPr>
-          <w:p>
-            <w:r>
-              <w:t>config.js, logistics_manager.js, utils.js, controller_signer.js</w:t>
-            </w:r>
-          </w:p>
-        </w:tc>
-      </w:tr>
-    </w:tbl>
-    <w:p/>
-    <w:p>
-      <w:pPr>
-        <w:pStyle w:val="Heading1"/>
-      </w:pPr>
-      <w:r>
-        <w:t>13. Practical Debug Order</w:t>
-      </w:r>
-    </w:p>
-    <w:p>
-      <w:pPr>
-        <w:pStyle w:val="ListNumber"/>
-      </w:pPr>
-      <w:r>
-        <w:t>Check room phase and buildStatus first.</w:t>
-      </w:r>
-    </w:p>
-    <w:p>
-      <w:pPr>
-        <w:pStyle w:val="ListNumber"/>
-      </w:pPr>
-      <w:r>
-        <w:t>Check the spawn queue written by spawn_manager.</w:t>
-      </w:r>
-    </w:p>
-    <w:p>
-      <w:pPr>
-        <w:pStyle w:val="ListNumber"/>
-      </w:pPr>
-      <w:r>
-        <w:t>Check the HUD construction block and remote panel for phase/build mismatch.</w:t>
-      </w:r>
-    </w:p>
-    <w:p>
-      <w:pPr>
-        <w:pStyle w:val="ListNumber"/>
-      </w:pPr>
-      <w:r>
-        <w:t>Check Memory.stats runtime pressure if behavior looks intentionally throttled.</w:t>
-      </w:r>
-    </w:p>
-    <w:p>
-      <w:pPr>
-        <w:pStyle w:val="ListNumber"/>
-      </w:pPr>
-      <w:r>
-        <w:t>Check remote intel cache if remotes look stale or intentionally latched.</w:t>
-      </w:r>
-    </w:p>
-    <w:p>
-      <w:pPr>
-        <w:pStyle w:val="ListNumber"/>
-      </w:pPr>
-      <w:r>
-        <w:t>Only then inspect the specific role or manager code path.</w:t>
-      </w:r>
-    </w:p>
-    <w:p>
-      <w:pPr>
-        <w:jc w:val="center"/>
-      </w:pPr>
-      <w:r>
-        <w:rPr>
-          <w:b/>
-        </w:rPr>
-        <w:t>End of manual</w:t>
+        <w:t>If a feature does not improve home-room stability, construction completion, controller throughput, or required defense, it should probably wait until after RCL8.</w:t>
       </w:r>
     </w:p>
     <w:sectPr>
+      <w:footerReference w:type="default" r:id="rId9"/>
       <w:pgSz w:w="12240" w:h="15840"/>
-      <w:pgMar w:top="1008" w:right="1224" w:bottom="1008" w:left="1224" w:header="720" w:footer="720" w:gutter="0"/>
+      <w:pgMar w:top="1008" w:right="1152" w:bottom="1008" w:left="1152" w:header="720" w:footer="720" w:gutter="0"/>
       <w:cols w:space="720"/>
       <w:docGrid w:linePitch="360"/>
     </w:sectPr>
   </w:body>
 </w:document>
+</file>
+
+<file path=word/footer1.xml><?xml version="1.0" encoding="utf-8"?>
+<w:ftr xmlns:m="http://schemas.openxmlformats.org/officeDocument/2006/math" xmlns:mc="http://schemas.openxmlformats.org/markup-compatibility/2006" xmlns:mo="http://schemas.microsoft.com/office/mac/office/2008/main" xmlns:mv="urn:schemas-microsoft-com:mac:vml" xmlns:o="urn:schemas-microsoft-com:office:office" xmlns:r="http://schemas.openxmlformats.org/officeDocument/2006/relationships" xmlns:v="urn:schemas-microsoft-com:vml" xmlns:w10="urn:schemas-microsoft-com:office:word" xmlns:w14="http://schemas.microsoft.com/office/word/2010/wordml" xmlns:w="http://schemas.openxmlformats.org/wordprocessingml/2006/main" xmlns:wne="http://schemas.microsoft.com/office/word/2006/wordml" xmlns:wp14="http://schemas.microsoft.com/office/word/2010/wordprocessingDrawing" xmlns:wp="http://schemas.openxmlformats.org/drawingml/2006/wordprocessingDrawing" xmlns:wpc="http://schemas.microsoft.com/office/word/2010/wordprocessingCanvas" xmlns:wpg="http://schemas.microsoft.com/office/word/2010/wordprocessingGroup" xmlns:wpi="http://schemas.microsoft.com/office/word/2010/wordprocessingInk" xmlns:wps="http://schemas.microsoft.com/office/word/2010/wordprocessingShape" mc:Ignorable="w14 wp14">
+  <w:p>
+    <w:pPr>
+      <w:pStyle w:val="Footer"/>
+      <w:jc w:val="center"/>
+    </w:pPr>
+    <w:r>
+      <w:rPr>
+        <w:rFonts w:ascii="Aptos" w:hAnsi="Aptos"/>
+        <w:color w:val="666666"/>
+        <w:sz w:val="16"/>
+      </w:rPr>
+      <w:t>screeps_omega developer manual - current dev branch</w:t>
+    </w:r>
+  </w:p>
+</w:ftr>
 </file>
 
 <file path=word/numbering.xml><?xml version="1.0" encoding="utf-8"?>
@@ -2573,11 +1687,11 @@
       <w:outlineLvl w:val="0"/>
     </w:pPr>
     <w:rPr>
-      <w:rFonts w:asciiTheme="majorHAnsi" w:eastAsiaTheme="majorEastAsia" w:hAnsiTheme="majorHAnsi" w:cstheme="majorBidi" w:ascii="Aptos" w:hAnsi="Aptos"/>
+      <w:rFonts w:asciiTheme="majorHAnsi" w:eastAsiaTheme="majorEastAsia" w:hAnsiTheme="majorHAnsi" w:cstheme="majorBidi" w:ascii="Aptos Display" w:hAnsi="Aptos Display"/>
       <w:b/>
       <w:bCs/>
-      <w:color w:val="365F91" w:themeColor="accent1" w:themeShade="BF"/>
-      <w:sz w:val="28"/>
+      <w:color w:val="1F4E79"/>
+      <w:sz w:val="34"/>
       <w:szCs w:val="28"/>
     </w:rPr>
   </w:style>
@@ -2597,10 +1711,10 @@
       <w:outlineLvl w:val="1"/>
     </w:pPr>
     <w:rPr>
-      <w:rFonts w:asciiTheme="majorHAnsi" w:eastAsiaTheme="majorEastAsia" w:hAnsiTheme="majorHAnsi" w:cstheme="majorBidi" w:ascii="Aptos" w:hAnsi="Aptos"/>
+      <w:rFonts w:asciiTheme="majorHAnsi" w:eastAsiaTheme="majorEastAsia" w:hAnsiTheme="majorHAnsi" w:cstheme="majorBidi" w:ascii="Aptos Display" w:hAnsi="Aptos Display"/>
       <w:b/>
       <w:bCs/>
-      <w:color w:val="4F81BD" w:themeColor="accent1"/>
+      <w:color w:val="1F4E79"/>
       <w:sz w:val="26"/>
       <w:szCs w:val="26"/>
     </w:rPr>
@@ -2621,7 +1735,7 @@
       <w:outlineLvl w:val="2"/>
     </w:pPr>
     <w:rPr>
-      <w:rFonts w:asciiTheme="majorHAnsi" w:eastAsiaTheme="majorEastAsia" w:hAnsiTheme="majorHAnsi" w:cstheme="majorBidi" w:ascii="Aptos" w:hAnsi="Aptos"/>
+      <w:rFonts w:asciiTheme="majorHAnsi" w:eastAsiaTheme="majorEastAsia" w:hAnsiTheme="majorHAnsi" w:cstheme="majorBidi"/>
       <w:b/>
       <w:bCs/>
       <w:color w:val="4F81BD" w:themeColor="accent1"/>
@@ -2862,7 +1976,7 @@
       <w:contextualSpacing/>
     </w:pPr>
     <w:rPr>
-      <w:rFonts w:asciiTheme="majorHAnsi" w:eastAsiaTheme="majorEastAsia" w:hAnsiTheme="majorHAnsi" w:cstheme="majorBidi" w:ascii="Aptos" w:hAnsi="Aptos"/>
+      <w:rFonts w:asciiTheme="majorHAnsi" w:eastAsiaTheme="majorEastAsia" w:hAnsiTheme="majorHAnsi" w:cstheme="majorBidi"/>
       <w:color w:val="17365D" w:themeColor="text2" w:themeShade="BF"/>
       <w:spacing w:val="5"/>
       <w:kern w:val="28"/>

</xml_diff>

<commit_message>
Refresh RCL8 roadmap and user manual docs
</commit_message>
<xml_diff>
--- a/docs/user_manual.docx
+++ b/docs/user_manual.docx
@@ -4,15 +4,10 @@
   <w:body>
     <w:p>
       <w:pPr>
+        <w:pStyle w:val="Title"/>
         <w:jc w:val="center"/>
       </w:pPr>
       <w:r>
-        <w:rPr>
-          <w:rFonts w:ascii="Aptos Display" w:hAnsi="Aptos Display"/>
-          <w:b/>
-          <w:color w:val="1F4E79"/>
-          <w:sz w:val="44"/>
-        </w:rPr>
         <w:t>screeps_omega Developer User Manual</w:t>
       </w:r>
     </w:p>
@@ -22,12 +17,9 @@
       </w:pPr>
       <w:r>
         <w:rPr>
-          <w:rFonts w:ascii="Aptos" w:hAnsi="Aptos"/>
           <w:i/>
-          <w:color w:val="555555"/>
-          <w:sz w:val="21"/>
         </w:rPr>
-        <w:t>Working manual for the current dev/ sourcecode. Single-room, controller-first, home-defense-only.</w:t>
+        <w:t>Working manual for the current dev/ source code. Home-room-first, controller-first, CPU-aware.</w:t>
       </w:r>
     </w:p>
     <w:p>
@@ -39,19 +31,8 @@
       </w:r>
     </w:p>
     <w:p>
-      <w:pPr>
-        <w:spacing w:after="80"/>
-      </w:pPr>
       <w:r>
-        <w:t>This manual describes the bot as it exists now. The current dev branch is a single-home-room Screeps bot that is optimized to reach a completed RCL8 before remote mining, claiming, or empire expansion return to scope.</w:t>
-      </w:r>
-    </w:p>
-    <w:p>
-      <w:pPr>
-        <w:spacing w:after="80"/>
-      </w:pPr>
-      <w:r>
-        <w:t>Use this document as an operator and developer reference. It is not a build bible. Start with room phase, build status, spawn queue, and config before changing deeper role or manager logic.</w:t>
+        <w:t>This manual describes the bot as it exists now in dev/. Use it as an operator and developer reference, not as a historical design document. Start with room phase, build status, spawn queue, and config before changing deeper role or manager logic.</w:t>
       </w:r>
     </w:p>
     <w:p>
@@ -67,7 +48,7 @@
         <w:pStyle w:val="ListBullet"/>
       </w:pPr>
       <w:r>
-        <w:t>One owned room only.</w:t>
+        <w:t>One owned room is the active development target.</w:t>
       </w:r>
     </w:p>
     <w:p>
@@ -83,7 +64,7 @@
         <w:pStyle w:val="ListBullet"/>
       </w:pPr>
       <w:r>
-        <w:t>Defense is reactive and home-room only.</w:t>
+        <w:t>Defense is home-room-first and reactive on the creep side.</w:t>
       </w:r>
     </w:p>
     <w:p>
@@ -91,7 +72,7 @@
         <w:pStyle w:val="ListBullet"/>
       </w:pPr>
       <w:r>
-        <w:t>Remote mining, remote defense, reservation, and empire control are intentionally removed from the active dev runtime.</w:t>
+        <w:t>Static defense construction now focuses on exit choke control rather than a spawn-centered wall ring.</w:t>
       </w:r>
     </w:p>
     <w:p>
@@ -99,7 +80,15 @@
         <w:pStyle w:val="ListBullet"/>
       </w:pPr>
       <w:r>
-        <w:t>CPU saving is a standing design rule.</w:t>
+        <w:t>CPU reduction is a standing engineering rule.</w:t>
+      </w:r>
+    </w:p>
+    <w:p>
+      <w:pPr>
+        <w:pStyle w:val="ListBullet"/>
+      </w:pPr>
+      <w:r>
+        <w:t>Remote and empire code may still exist in the repo, but the active dev build is centered on the home-room RCL8 path.</w:t>
       </w:r>
     </w:p>
     <w:p>
@@ -112,7 +101,7 @@
     </w:p>
     <w:p>
       <w:pPr>
-        <w:pStyle w:val="ListBullet"/>
+        <w:pStyle w:val="ListNumber"/>
       </w:pPr>
       <w:r>
         <w:t>dev/main.js is the Screeps entry point and calls kernel_loop.</w:t>
@@ -120,7 +109,7 @@
     </w:p>
     <w:p>
       <w:pPr>
-        <w:pStyle w:val="ListBullet"/>
+        <w:pStyle w:val="ListNumber"/>
       </w:pPr>
       <w:r>
         <w:t>dev/kernel_loop.js handles memory cleanup, owned-room collection, room execution, and CPU snapshot recording.</w:t>
@@ -128,7 +117,7 @@
     </w:p>
     <w:p>
       <w:pPr>
-        <w:pStyle w:val="ListBullet"/>
+        <w:pStyle w:val="ListNumber"/>
       </w:pPr>
       <w:r>
         <w:t>dev/room_manager.js runs one owned room through state collection, construction, towers, spawning, creeps, signing, directives, and HUD.</w:t>
@@ -136,18 +125,18 @@
     </w:p>
     <w:p>
       <w:pPr>
-        <w:pStyle w:val="ListBullet"/>
+        <w:pStyle w:val="ListNumber"/>
       </w:pPr>
       <w:r>
-        <w:t>dev/room_state.js collects shared facts once and determines the current room phase.</w:t>
+        <w:t>dev/room_state.js collects shared facts once, determines the current room phase, and attaches build status for downstream systems.</w:t>
       </w:r>
     </w:p>
     <w:p>
       <w:pPr>
-        <w:pStyle w:val="ListBullet"/>
+        <w:pStyle w:val="ListNumber"/>
       </w:pPr>
       <w:r>
-        <w:t>utils.js holds tick-local runtime cache so managers and roles can reuse room scans.</w:t>
+        <w:t>dev/utils.js holds tick-local runtime cache so managers and roles can reuse room scans.</w:t>
       </w:r>
     </w:p>
     <w:p>
@@ -159,28 +148,24 @@
       </w:r>
     </w:p>
     <w:p>
-      <w:pPr>
-        <w:spacing w:after="80"/>
-      </w:pPr>
       <w:r>
-        <w:t>The room phase is the main operating mode. Construction, spawning, and recovery behavior all key off this state.</w:t>
+        <w:t>The room phase is the main operating mode. Construction, spawning, logistics, and recovery behavior key off this state.</w:t>
       </w:r>
     </w:p>
     <w:tbl>
       <w:tblPr>
         <w:tblStyle w:val="TableGrid"/>
         <w:tblW w:type="auto" w:w="0"/>
-        <w:jc w:val="center"/>
         <w:tblLook w:firstColumn="1" w:firstRow="1" w:lastColumn="0" w:lastRow="0" w:noHBand="0" w:noVBand="1" w:val="04A0"/>
       </w:tblPr>
       <w:tblGrid>
-        <w:gridCol w:w="4968"/>
-        <w:gridCol w:w="4968"/>
+        <w:gridCol w:w="4320"/>
+        <w:gridCol w:w="4320"/>
       </w:tblGrid>
       <w:tr>
         <w:tc>
           <w:tcPr>
-            <w:tcW w:type="dxa" w:w="4968"/>
+            <w:tcW w:type="dxa" w:w="4320"/>
           </w:tcPr>
           <w:p>
             <w:r>
@@ -190,7 +175,7 @@
         </w:tc>
         <w:tc>
           <w:tcPr>
-            <w:tcW w:type="dxa" w:w="4968"/>
+            <w:tcW w:type="dxa" w:w="4320"/>
           </w:tcPr>
           <w:p>
             <w:r>
@@ -202,29 +187,7 @@
       <w:tr>
         <w:tc>
           <w:tcPr>
-            <w:tcW w:type="dxa" w:w="4968"/>
-          </w:tcPr>
-          <w:p>
-            <w:r>
-              <w:t>bootstrap_jr</w:t>
-            </w:r>
-          </w:p>
-        </w:tc>
-        <w:tc>
-          <w:tcPr>
-            <w:tcW w:type="dxa" w:w="4968"/>
-          </w:tcPr>
-          <w:p>
-            <w:r>
-              <w:t>Early survival. JrWorkers keep the room alive and controller progress moving.</w:t>
-            </w:r>
-          </w:p>
-        </w:tc>
-      </w:tr>
-      <w:tr>
-        <w:tc>
-          <w:tcPr>
-            <w:tcW w:type="dxa" w:w="4968"/>
+            <w:tcW w:type="dxa" w:w="4320"/>
           </w:tcPr>
           <w:p>
             <w:r>
@@ -234,11 +197,11 @@
         </w:tc>
         <w:tc>
           <w:tcPr>
-            <w:tcW w:type="dxa" w:w="4968"/>
+            <w:tcW w:type="dxa" w:w="4320"/>
           </w:tcPr>
           <w:p>
             <w:r>
-              <w:t>Core source containers and backbone roads are built and worker replacement begins.</w:t>
+              <w:t>Early survival. JrWorkers keep the room alive and push to RCL2.</w:t>
             </w:r>
           </w:p>
         </w:tc>
@@ -246,21 +209,21 @@
       <w:tr>
         <w:tc>
           <w:tcPr>
-            <w:tcW w:type="dxa" w:w="4968"/>
+            <w:tcW w:type="dxa" w:w="4320"/>
           </w:tcPr>
           <w:p>
             <w:r>
-              <w:t>developing</w:t>
+              <w:t>foundation</w:t>
             </w:r>
           </w:p>
         </w:tc>
         <w:tc>
           <w:tcPr>
-            <w:tcW w:type="dxa" w:w="4968"/>
+            <w:tcW w:type="dxa" w:w="4320"/>
           </w:tcPr>
           <w:p>
             <w:r>
-              <w:t>Extensions, tower, storage, roads, and defense are built while the economy stabilizes.</w:t>
+              <w:t>Build source containers and the first durable road backbone.</w:t>
             </w:r>
           </w:p>
         </w:tc>
@@ -268,21 +231,21 @@
       <w:tr>
         <w:tc>
           <w:tcPr>
-            <w:tcW w:type="dxa" w:w="4968"/>
+            <w:tcW w:type="dxa" w:w="4320"/>
           </w:tcPr>
           <w:p>
             <w:r>
-              <w:t>stable</w:t>
+              <w:t>development</w:t>
             </w:r>
           </w:p>
         </w:tc>
         <w:tc>
           <w:tcPr>
-            <w:tcW w:type="dxa" w:w="4968"/>
+            <w:tcW w:type="dxa" w:w="4320"/>
           </w:tcPr>
           <w:p>
             <w:r>
-              <w:t>Current-RCL home layout is complete enough to run cleanly and support higher throughput.</w:t>
+              <w:t>Build extensions, first tower, storage, internal roads, and baseline defense.</w:t>
             </w:r>
           </w:p>
         </w:tc>
@@ -290,21 +253,21 @@
       <w:tr>
         <w:tc>
           <w:tcPr>
-            <w:tcW w:type="dxa" w:w="4968"/>
+            <w:tcW w:type="dxa" w:w="4320"/>
           </w:tcPr>
           <w:p>
             <w:r>
-              <w:t>rcl5</w:t>
+              <w:t>logistics</w:t>
             </w:r>
           </w:p>
         </w:tc>
         <w:tc>
           <w:tcPr>
-            <w:tcW w:type="dxa" w:w="4968"/>
+            <w:tcW w:type="dxa" w:w="4320"/>
           </w:tcPr>
           <w:p>
             <w:r>
-              <w:t>Link backbone planning and buildout begin.</w:t>
+              <w:t>Add the first link backbone and reduce hauling pressure.</w:t>
             </w:r>
           </w:p>
         </w:tc>
@@ -312,21 +275,65 @@
       <w:tr>
         <w:tc>
           <w:tcPr>
-            <w:tcW w:type="dxa" w:w="4968"/>
+            <w:tcW w:type="dxa" w:w="4320"/>
           </w:tcPr>
           <w:p>
             <w:r>
-              <w:t>rcl6</w:t>
+              <w:t>specialization</w:t>
             </w:r>
           </w:p>
         </w:tc>
         <w:tc>
           <w:tcPr>
-            <w:tcW w:type="dxa" w:w="4968"/>
+            <w:tcW w:type="dxa" w:w="4320"/>
           </w:tcPr>
           <w:p>
             <w:r>
-              <w:t>Terminal, extractor, and first lab cluster planning/buildout begin.</w:t>
+              <w:t>Add terminal, extractor, and the first lab cluster.</w:t>
+            </w:r>
+          </w:p>
+        </w:tc>
+      </w:tr>
+      <w:tr>
+        <w:tc>
+          <w:tcPr>
+            <w:tcW w:type="dxa" w:w="4320"/>
+          </w:tcPr>
+          <w:p>
+            <w:r>
+              <w:t>fortification</w:t>
+            </w:r>
+          </w:p>
+        </w:tc>
+        <w:tc>
+          <w:tcPr>
+            <w:tcW w:type="dxa" w:w="4320"/>
+          </w:tcPr>
+          <w:p>
+            <w:r>
+              <w:t>Expand late-game infrastructure with more links, more labs, stronger defense posture, and factory placement.</w:t>
+            </w:r>
+          </w:p>
+        </w:tc>
+      </w:tr>
+      <w:tr>
+        <w:tc>
+          <w:tcPr>
+            <w:tcW w:type="dxa" w:w="4320"/>
+          </w:tcPr>
+          <w:p>
+            <w:r>
+              <w:t>command</w:t>
+            </w:r>
+          </w:p>
+        </w:tc>
+        <w:tc>
+          <w:tcPr>
+            <w:tcW w:type="dxa" w:w="4320"/>
+          </w:tcPr>
+          <w:p>
+            <w:r>
+              <w:t>Finish the full RCL8 construction layout with observer, power spawn, and nuker placement.</w:t>
             </w:r>
           </w:p>
         </w:tc>
@@ -345,7 +352,7 @@
         <w:pStyle w:val="ListBullet"/>
       </w:pPr>
       <w:r>
-        <w:t>construction_roadmap.js defines the intent for each phase and later RCL roadmap stage.</w:t>
+        <w:t>construction_roadmap.js defines what each named room phase is trying to build.</w:t>
       </w:r>
     </w:p>
     <w:p>
@@ -369,7 +376,7 @@
         <w:pStyle w:val="ListBullet"/>
       </w:pPr>
       <w:r>
-        <w:t>Advanced RCL5/RCL6 planning is cache-driven. Future link, terminal, extractor, and lab placement is stored in room memory and reused instead of being recomputed every tick.</w:t>
+        <w:t>defense_layout.js plans terrain-based exit choke barriers with two-tile rampart gates near room passages.</w:t>
       </w:r>
     </w:p>
     <w:p>
@@ -377,7 +384,12 @@
         <w:pStyle w:val="ListBullet"/>
       </w:pPr>
       <w:r>
-        <w:t>The old controller-container requirement has been removed from active planning. Backbone roads now connect the spawn network to the controller path directly.</w:t>
+        <w:t>Advanced construction planning is cache-driven. Future link, terminal, extractor, lab, factory, observer, power spawn, and nuker placement is stored in room memory and reused instead of being recomputed every tick.</w:t>
+      </w:r>
+    </w:p>
+    <w:p>
+      <w:r>
+        <w:t>The construction path now covers the full room buildout through command / RCL8. That means construction placement exists for late-game structures, but operating automation for labs, factory work, observer scans, power processing, and nuker use is still a separate gap.</w:t>
       </w:r>
     </w:p>
     <w:p>
@@ -401,7 +413,7 @@
         <w:pStyle w:val="ListBullet"/>
       </w:pPr>
       <w:r>
-        <w:t>bodies.js chooses role bodies from room energy capacity and defender threat level.</w:t>
+        <w:t>bodies.js chooses role bodies from room energy capacity and threat level.</w:t>
       </w:r>
     </w:p>
     <w:p>
@@ -409,7 +421,7 @@
         <w:pStyle w:val="ListBullet"/>
       </w:pPr>
       <w:r>
-        <w:t>The active workforce is home-only: jrworker, worker, miner, hauler, upgrader, repair, defender.</w:t>
+        <w:t>The active home-room workforce is jrworker, worker, miner, hauler, upgrader, repair, and defender.</w:t>
       </w:r>
     </w:p>
     <w:p>
@@ -417,15 +429,7 @@
         <w:pStyle w:val="ListBullet"/>
       </w:pPr>
       <w:r>
-        <w:t>Upgraders no longer require a dedicated controller container target to spawn or operate.</w:t>
-      </w:r>
-    </w:p>
-    <w:p>
-      <w:pPr>
-        <w:pStyle w:val="ListBullet"/>
-      </w:pPr>
-      <w:r>
-        <w:t>Upgrader body tiers now include more carry and move so they can self-supply cleanly.</w:t>
+        <w:t>Upgraders are self-supplied and no longer depend on a controller container path.</w:t>
       </w:r>
     </w:p>
     <w:p>
@@ -440,17 +444,16 @@
       <w:tblPr>
         <w:tblStyle w:val="TableGrid"/>
         <w:tblW w:type="auto" w:w="0"/>
-        <w:jc w:val="center"/>
         <w:tblLook w:firstColumn="1" w:firstRow="1" w:lastColumn="0" w:lastRow="0" w:noHBand="0" w:noVBand="1" w:val="04A0"/>
       </w:tblPr>
       <w:tblGrid>
-        <w:gridCol w:w="4968"/>
-        <w:gridCol w:w="4968"/>
+        <w:gridCol w:w="4320"/>
+        <w:gridCol w:w="4320"/>
       </w:tblGrid>
       <w:tr>
         <w:tc>
           <w:tcPr>
-            <w:tcW w:type="dxa" w:w="4968"/>
+            <w:tcW w:type="dxa" w:w="4320"/>
           </w:tcPr>
           <w:p>
             <w:r>
@@ -460,7 +463,7 @@
         </w:tc>
         <w:tc>
           <w:tcPr>
-            <w:tcW w:type="dxa" w:w="4968"/>
+            <w:tcW w:type="dxa" w:w="4320"/>
           </w:tcPr>
           <w:p>
             <w:r>
@@ -472,7 +475,7 @@
       <w:tr>
         <w:tc>
           <w:tcPr>
-            <w:tcW w:type="dxa" w:w="4968"/>
+            <w:tcW w:type="dxa" w:w="4320"/>
           </w:tcPr>
           <w:p>
             <w:r>
@@ -482,11 +485,11 @@
         </w:tc>
         <w:tc>
           <w:tcPr>
-            <w:tcW w:type="dxa" w:w="4968"/>
+            <w:tcW w:type="dxa" w:w="4320"/>
           </w:tcPr>
           <w:p>
             <w:r>
-              <w:t>Bootstrap-only survival labor. Pulls from storage or containers first, then harvests.</w:t>
+              <w:t>Bootstrap-only survival labor. Pulls from shared room buffers first, then harvests if needed.</w:t>
             </w:r>
           </w:p>
         </w:tc>
@@ -494,7 +497,7 @@
       <w:tr>
         <w:tc>
           <w:tcPr>
-            <w:tcW w:type="dxa" w:w="4968"/>
+            <w:tcW w:type="dxa" w:w="4320"/>
           </w:tcPr>
           <w:p>
             <w:r>
@@ -504,7 +507,7 @@
         </w:tc>
         <w:tc>
           <w:tcPr>
-            <w:tcW w:type="dxa" w:w="4968"/>
+            <w:tcW w:type="dxa" w:w="4320"/>
           </w:tcPr>
           <w:p>
             <w:r>
@@ -516,7 +519,7 @@
       <w:tr>
         <w:tc>
           <w:tcPr>
-            <w:tcW w:type="dxa" w:w="4968"/>
+            <w:tcW w:type="dxa" w:w="4320"/>
           </w:tcPr>
           <w:p>
             <w:r>
@@ -526,7 +529,7 @@
         </w:tc>
         <w:tc>
           <w:tcPr>
-            <w:tcW w:type="dxa" w:w="4968"/>
+            <w:tcW w:type="dxa" w:w="4320"/>
           </w:tcPr>
           <w:p>
             <w:r>
@@ -538,7 +541,7 @@
       <w:tr>
         <w:tc>
           <w:tcPr>
-            <w:tcW w:type="dxa" w:w="4968"/>
+            <w:tcW w:type="dxa" w:w="4320"/>
           </w:tcPr>
           <w:p>
             <w:r>
@@ -548,11 +551,11 @@
         </w:tc>
         <w:tc>
           <w:tcPr>
-            <w:tcW w:type="dxa" w:w="4968"/>
+            <w:tcW w:type="dxa" w:w="4320"/>
           </w:tcPr>
           <w:p>
             <w:r>
-              <w:t>Moves source-side energy into the room economy. No controller-container reservation path remains.</w:t>
+              <w:t>Moves source-side energy into the room economy and supports towers and late infrastructure feed paths.</w:t>
             </w:r>
           </w:p>
         </w:tc>
@@ -560,7 +563,7 @@
       <w:tr>
         <w:tc>
           <w:tcPr>
-            <w:tcW w:type="dxa" w:w="4968"/>
+            <w:tcW w:type="dxa" w:w="4320"/>
           </w:tcPr>
           <w:p>
             <w:r>
@@ -570,7 +573,7 @@
         </w:tc>
         <w:tc>
           <w:tcPr>
-            <w:tcW w:type="dxa" w:w="4968"/>
+            <w:tcW w:type="dxa" w:w="4320"/>
           </w:tcPr>
           <w:p>
             <w:r>
@@ -582,7 +585,7 @@
       <w:tr>
         <w:tc>
           <w:tcPr>
-            <w:tcW w:type="dxa" w:w="4968"/>
+            <w:tcW w:type="dxa" w:w="4320"/>
           </w:tcPr>
           <w:p>
             <w:r>
@@ -592,11 +595,11 @@
         </w:tc>
         <w:tc>
           <w:tcPr>
-            <w:tcW w:type="dxa" w:w="4968"/>
+            <w:tcW w:type="dxa" w:w="4320"/>
           </w:tcPr>
           <w:p>
             <w:r>
-              <w:t>Maintains roads, containers, defenses, and builds or upgrades as fallback.</w:t>
+              <w:t>Maintains roads, containers, walls, and ramparts, and can fall back to build or upgrade work.</w:t>
             </w:r>
           </w:p>
         </w:tc>
@@ -604,7 +607,7 @@
       <w:tr>
         <w:tc>
           <w:tcPr>
-            <w:tcW w:type="dxa" w:w="4968"/>
+            <w:tcW w:type="dxa" w:w="4320"/>
           </w:tcPr>
           <w:p>
             <w:r>
@@ -614,7 +617,7 @@
         </w:tc>
         <w:tc>
           <w:tcPr>
-            <w:tcW w:type="dxa" w:w="4968"/>
+            <w:tcW w:type="dxa" w:w="4320"/>
           </w:tcPr>
           <w:p>
             <w:r>
@@ -629,46 +632,6 @@
         <w:pStyle w:val="Heading1"/>
       </w:pPr>
       <w:r>
-        <w:t>Logistics And Upgrader Model</w:t>
-      </w:r>
-    </w:p>
-    <w:p>
-      <w:pPr>
-        <w:pStyle w:val="ListBullet"/>
-      </w:pPr>
-      <w:r>
-        <w:t>logistics_manager.js defines shared energy withdrawal and delivery rules.</w:t>
-      </w:r>
-    </w:p>
-    <w:p>
-      <w:pPr>
-        <w:pStyle w:val="ListBullet"/>
-      </w:pPr>
-      <w:r>
-        <w:t>General withdrawal order is storage first, then source containers, then active harvesting as fallback.</w:t>
-      </w:r>
-    </w:p>
-    <w:p>
-      <w:pPr>
-        <w:pStyle w:val="ListBullet"/>
-      </w:pPr>
-      <w:r>
-        <w:t>Haulers now feed spawn, extensions, storage, and tower reserves. They do not reserve energy for a controller container.</w:t>
-      </w:r>
-    </w:p>
-    <w:p>
-      <w:pPr>
-        <w:pStyle w:val="ListBullet"/>
-      </w:pPr>
-      <w:r>
-        <w:t>Upgraders now behave like other self-supplied creeps on the pickup side, but they remain controller-only on the work side.</w:t>
-      </w:r>
-    </w:p>
-    <w:p>
-      <w:pPr>
-        <w:pStyle w:val="Heading1"/>
-      </w:pPr>
-      <w:r>
         <w:t>Defense</w:t>
       </w:r>
     </w:p>
@@ -677,7 +640,7 @@
         <w:pStyle w:val="ListBullet"/>
       </w:pPr>
       <w:r>
-        <w:t>defense_manager.js is now a home-room-only threat planner.</w:t>
+        <w:t>defense_layout.js handles static defense construction. It scans room exits, finds narrow terrain chokes, and seals them with walls while leaving two adjacent ramparts for each planned gate.</w:t>
       </w:r>
     </w:p>
     <w:p>
@@ -685,7 +648,15 @@
         <w:pStyle w:val="ListBullet"/>
       </w:pPr>
       <w:r>
-        <w:t>spawn_manager.js reactively spawns defender creeps when home threats appear.</w:t>
+        <w:t>defense_manager.js remains the reactive threat planner for home-room hostile response.</w:t>
+      </w:r>
+    </w:p>
+    <w:p>
+      <w:pPr>
+        <w:pStyle w:val="ListBullet"/>
+      </w:pPr>
+      <w:r>
+        <w:t>spawn_manager.js reactively spawns defenders when home threats appear.</w:t>
       </w:r>
     </w:p>
     <w:p>
@@ -701,7 +672,7 @@
         <w:pStyle w:val="ListBullet"/>
       </w:pPr>
       <w:r>
-        <w:t>tower_manager.js remains narrow: attack, heal, and repair without broad combat rewrite.</w:t>
+        <w:t>tower_manager.js stays narrow: attack, heal, and repair without a broad combat rewrite.</w:t>
       </w:r>
     </w:p>
     <w:p>
@@ -717,7 +688,7 @@
         <w:pStyle w:val="ListBullet"/>
       </w:pPr>
       <w:r>
-        <w:t>hud.js is now home-room only. It shows room status, role counts, construction checklist, source lines, creep labels, and console summary.</w:t>
+        <w:t>hud.js is home-room focused. It shows room status, role counts, source lines, creep labels, and the construction checklist.</w:t>
       </w:r>
     </w:p>
     <w:p>
@@ -725,7 +696,7 @@
         <w:pStyle w:val="ListBullet"/>
       </w:pPr>
       <w:r>
-        <w:t>The remote panels and remote creep overlays have been removed from the active HUD.</w:t>
+        <w:t>The construction checklist can show roadmap phase, future-plan readiness, and advanced structure progress.</w:t>
       </w:r>
     </w:p>
     <w:p>
@@ -733,7 +704,15 @@
         <w:pStyle w:val="ListBullet"/>
       </w:pPr>
       <w:r>
-        <w:t>directive_manager.js provides themed room-level console updates for phase changes, milestones, performance, progress, construction, and operations.</w:t>
+        <w:t>directive_manager.js provides room-level console updates for phase changes, milestones, performance, progress, construction, and operations.</w:t>
+      </w:r>
+    </w:p>
+    <w:p>
+      <w:pPr>
+        <w:pStyle w:val="ListBullet"/>
+      </w:pPr>
+      <w:r>
+        <w:t>Runtime pressure can still suppress HUD and directive output when CPU policy says to back off.</w:t>
       </w:r>
     </w:p>
     <w:p>
@@ -757,7 +736,7 @@
         <w:pStyle w:val="ListBullet"/>
       </w:pPr>
       <w:r>
-        <w:t>Detail mode now focuses on top-level room sections and per-role costs. Remote CPU sections have been removed with the remote system.</w:t>
+        <w:t>kernel_profiler.js tracks per-section CPU timing so expensive room steps can be identified.</w:t>
       </w:r>
     </w:p>
     <w:p>
@@ -765,7 +744,15 @@
         <w:pStyle w:val="ListBullet"/>
       </w:pPr>
       <w:r>
-        <w:t>Runtime pressure can still downgrade detail logging, stretch think intervals, and stretch construction cadence.</w:t>
+        <w:t>Runtime pressure can stretch think intervals, stretch construction cadence, and skip optional visibility work.</w:t>
+      </w:r>
+    </w:p>
+    <w:p>
+      <w:pPr>
+        <w:pStyle w:val="ListBullet"/>
+      </w:pPr>
+      <w:r>
+        <w:t>The defense layout now uses both tick-local caching and room-memory caching to avoid repeating terrain analysis.</w:t>
       </w:r>
     </w:p>
     <w:p>
@@ -805,6 +792,14 @@
         <w:pStyle w:val="ListBullet"/>
       </w:pPr>
       <w:r>
+        <w:t>Use DEFENSE for choke-depth tuning and reactive defense settings.</w:t>
+      </w:r>
+    </w:p>
+    <w:p>
+      <w:pPr>
+        <w:pStyle w:val="ListBullet"/>
+      </w:pPr>
+      <w:r>
         <w:t>Use LOGISTICS for tower refill thresholds.</w:t>
       </w:r>
     </w:p>
@@ -813,15 +808,7 @@
         <w:pStyle w:val="ListBullet"/>
       </w:pPr>
       <w:r>
-        <w:t>Use DEFENSE for home-defense reaction tuning.</w:t>
-      </w:r>
-    </w:p>
-    <w:p>
-      <w:pPr>
-        <w:pStyle w:val="ListBullet"/>
-      </w:pPr>
-      <w:r>
-        <w:t>Use STATS for CPU console mode and runtime-pressure policy.</w:t>
+        <w:t>Use STATS for runtime-pressure policy and CPU reporting.</w:t>
       </w:r>
     </w:p>
     <w:p>
@@ -861,6 +848,14 @@
         <w:pStyle w:val="ListBullet"/>
       </w:pPr>
       <w:r>
+        <w:t>Memory.rooms[roomName].defenseLayout stores the cached exit-choke wall and gate plan.</w:t>
+      </w:r>
+    </w:p>
+    <w:p>
+      <w:pPr>
+        <w:pStyle w:val="ListBullet"/>
+      </w:pPr>
+      <w:r>
         <w:t>Memory.rooms[roomName].spawnQueue stores the readable spawn queue snapshot.</w:t>
       </w:r>
     </w:p>
@@ -885,7 +880,7 @@
         <w:pStyle w:val="Heading1"/>
       </w:pPr>
       <w:r>
-        <w:t>Practical Debug Order</w:t>
+        <w:t>Known Current Gaps</w:t>
       </w:r>
     </w:p>
     <w:p>
@@ -893,7 +888,7 @@
         <w:pStyle w:val="ListBullet"/>
       </w:pPr>
       <w:r>
-        <w:t>Check room phase first.</w:t>
+        <w:t>Lab reactions are not yet automated beyond construction planning and placement.</w:t>
       </w:r>
     </w:p>
     <w:p>
@@ -901,7 +896,7 @@
         <w:pStyle w:val="ListBullet"/>
       </w:pPr>
       <w:r>
-        <w:t>Check buildStatus second.</w:t>
+        <w:t>Factory production policy is not yet implemented.</w:t>
       </w:r>
     </w:p>
     <w:p>
@@ -909,7 +904,7 @@
         <w:pStyle w:val="ListBullet"/>
       </w:pPr>
       <w:r>
-        <w:t>Check the spawn queue written into room memory.</w:t>
+        <w:t>Observer scans, power spawn processing, and nuker operation are not yet implemented beyond construction placement and status tracking.</w:t>
       </w:r>
     </w:p>
     <w:p>
@@ -917,15 +912,63 @@
         <w:pStyle w:val="ListBullet"/>
       </w:pPr>
       <w:r>
+        <w:t>Live validation is still needed for some late-game and terrain-heavy layouts even when the planners pass static checks.</w:t>
+      </w:r>
+    </w:p>
+    <w:p>
+      <w:pPr>
+        <w:pStyle w:val="Heading1"/>
+      </w:pPr>
+      <w:r>
+        <w:t>Practical Debug Order</w:t>
+      </w:r>
+    </w:p>
+    <w:p>
+      <w:pPr>
+        <w:pStyle w:val="ListNumber"/>
+      </w:pPr>
+      <w:r>
+        <w:t>Check room phase first.</w:t>
+      </w:r>
+    </w:p>
+    <w:p>
+      <w:pPr>
+        <w:pStyle w:val="ListNumber"/>
+      </w:pPr>
+      <w:r>
+        <w:t>Check buildStatus second.</w:t>
+      </w:r>
+    </w:p>
+    <w:p>
+      <w:pPr>
+        <w:pStyle w:val="ListNumber"/>
+      </w:pPr>
+      <w:r>
+        <w:t>Check the spawn queue written into room memory.</w:t>
+      </w:r>
+    </w:p>
+    <w:p>
+      <w:pPr>
+        <w:pStyle w:val="ListNumber"/>
+      </w:pPr>
+      <w:r>
         <w:t>Check CPU runtime mode if behavior seems intentionally throttled.</w:t>
       </w:r>
     </w:p>
     <w:p>
       <w:pPr>
-        <w:pStyle w:val="ListBullet"/>
+        <w:pStyle w:val="ListNumber"/>
       </w:pPr>
       <w:r>
-        <w:t>Check the specific role logic only after the higher-level state looks correct.</w:t>
+        <w:t>Check cached construction and defense plans if layout or wall behavior looks wrong.</w:t>
+      </w:r>
+    </w:p>
+    <w:p>
+      <w:pPr>
+        <w:pStyle w:val="ListNumber"/>
+      </w:pPr>
+      <w:r>
+        <w:t>Check specific role logic only after the higher-level state looks correct.</w:t>
       </w:r>
     </w:p>
     <w:p>
@@ -940,17 +983,16 @@
       <w:tblPr>
         <w:tblStyle w:val="TableGrid"/>
         <w:tblW w:type="auto" w:w="0"/>
-        <w:jc w:val="center"/>
         <w:tblLook w:firstColumn="1" w:firstRow="1" w:lastColumn="0" w:lastRow="0" w:noHBand="0" w:noVBand="1" w:val="04A0"/>
       </w:tblPr>
       <w:tblGrid>
-        <w:gridCol w:w="4968"/>
-        <w:gridCol w:w="4968"/>
+        <w:gridCol w:w="4320"/>
+        <w:gridCol w:w="4320"/>
       </w:tblGrid>
       <w:tr>
         <w:tc>
           <w:tcPr>
-            <w:tcW w:type="dxa" w:w="4968"/>
+            <w:tcW w:type="dxa" w:w="4320"/>
           </w:tcPr>
           <w:p>
             <w:r>
@@ -960,7 +1002,7 @@
         </w:tc>
         <w:tc>
           <w:tcPr>
-            <w:tcW w:type="dxa" w:w="4968"/>
+            <w:tcW w:type="dxa" w:w="4320"/>
           </w:tcPr>
           <w:p>
             <w:r>
@@ -972,7 +1014,7 @@
       <w:tr>
         <w:tc>
           <w:tcPr>
-            <w:tcW w:type="dxa" w:w="4968"/>
+            <w:tcW w:type="dxa" w:w="4320"/>
           </w:tcPr>
           <w:p>
             <w:r>
@@ -982,7 +1024,7 @@
         </w:tc>
         <w:tc>
           <w:tcPr>
-            <w:tcW w:type="dxa" w:w="4968"/>
+            <w:tcW w:type="dxa" w:w="4320"/>
           </w:tcPr>
           <w:p>
             <w:r>
@@ -994,7 +1036,7 @@
       <w:tr>
         <w:tc>
           <w:tcPr>
-            <w:tcW w:type="dxa" w:w="4968"/>
+            <w:tcW w:type="dxa" w:w="4320"/>
           </w:tcPr>
           <w:p>
             <w:r>
@@ -1004,7 +1046,7 @@
         </w:tc>
         <w:tc>
           <w:tcPr>
-            <w:tcW w:type="dxa" w:w="4968"/>
+            <w:tcW w:type="dxa" w:w="4320"/>
           </w:tcPr>
           <w:p>
             <w:r>
@@ -1016,7 +1058,7 @@
       <w:tr>
         <w:tc>
           <w:tcPr>
-            <w:tcW w:type="dxa" w:w="4968"/>
+            <w:tcW w:type="dxa" w:w="4320"/>
           </w:tcPr>
           <w:p>
             <w:r>
@@ -1026,7 +1068,7 @@
         </w:tc>
         <w:tc>
           <w:tcPr>
-            <w:tcW w:type="dxa" w:w="4968"/>
+            <w:tcW w:type="dxa" w:w="4320"/>
           </w:tcPr>
           <w:p>
             <w:r>
@@ -1038,7 +1080,29 @@
       <w:tr>
         <w:tc>
           <w:tcPr>
-            <w:tcW w:type="dxa" w:w="4968"/>
+            <w:tcW w:type="dxa" w:w="4320"/>
+          </w:tcPr>
+          <w:p>
+            <w:r>
+              <w:t>dev/defense_layout.js, dev/defense_manager.js, and dev/tower_manager.js</w:t>
+            </w:r>
+          </w:p>
+        </w:tc>
+        <w:tc>
+          <w:tcPr>
+            <w:tcW w:type="dxa" w:w="4320"/>
+          </w:tcPr>
+          <w:p>
+            <w:r>
+              <w:t>Static defense layout, threat planning, and tower behavior.</w:t>
+            </w:r>
+          </w:p>
+        </w:tc>
+      </w:tr>
+      <w:tr>
+        <w:tc>
+          <w:tcPr>
+            <w:tcW w:type="dxa" w:w="4320"/>
           </w:tcPr>
           <w:p>
             <w:r>
@@ -1048,7 +1112,7 @@
         </w:tc>
         <w:tc>
           <w:tcPr>
-            <w:tcW w:type="dxa" w:w="4968"/>
+            <w:tcW w:type="dxa" w:w="4320"/>
           </w:tcPr>
           <w:p>
             <w:r>
@@ -1060,7 +1124,7 @@
       <w:tr>
         <w:tc>
           <w:tcPr>
-            <w:tcW w:type="dxa" w:w="4968"/>
+            <w:tcW w:type="dxa" w:w="4320"/>
           </w:tcPr>
           <w:p>
             <w:r>
@@ -1070,7 +1134,7 @@
         </w:tc>
         <w:tc>
           <w:tcPr>
-            <w:tcW w:type="dxa" w:w="4968"/>
+            <w:tcW w:type="dxa" w:w="4320"/>
           </w:tcPr>
           <w:p>
             <w:r>
@@ -1082,7 +1146,7 @@
       <w:tr>
         <w:tc>
           <w:tcPr>
-            <w:tcW w:type="dxa" w:w="4968"/>
+            <w:tcW w:type="dxa" w:w="4320"/>
           </w:tcPr>
           <w:p>
             <w:r>
@@ -1092,7 +1156,7 @@
         </w:tc>
         <w:tc>
           <w:tcPr>
-            <w:tcW w:type="dxa" w:w="4968"/>
+            <w:tcW w:type="dxa" w:w="4320"/>
           </w:tcPr>
           <w:p>
             <w:r>
@@ -1104,29 +1168,7 @@
       <w:tr>
         <w:tc>
           <w:tcPr>
-            <w:tcW w:type="dxa" w:w="4968"/>
-          </w:tcPr>
-          <w:p>
-            <w:r>
-              <w:t>dev/defense_manager.js and dev/tower_manager.js</w:t>
-            </w:r>
-          </w:p>
-        </w:tc>
-        <w:tc>
-          <w:tcPr>
-            <w:tcW w:type="dxa" w:w="4968"/>
-          </w:tcPr>
-          <w:p>
-            <w:r>
-              <w:t>Home defense planning and tower behavior.</w:t>
-            </w:r>
-          </w:p>
-        </w:tc>
-      </w:tr>
-      <w:tr>
-        <w:tc>
-          <w:tcPr>
-            <w:tcW w:type="dxa" w:w="4968"/>
+            <w:tcW w:type="dxa" w:w="4320"/>
           </w:tcPr>
           <w:p>
             <w:r>
@@ -1136,7 +1178,7 @@
         </w:tc>
         <w:tc>
           <w:tcPr>
-            <w:tcW w:type="dxa" w:w="4968"/>
+            <w:tcW w:type="dxa" w:w="4320"/>
           </w:tcPr>
           <w:p>
             <w:r>
@@ -1148,7 +1190,7 @@
       <w:tr>
         <w:tc>
           <w:tcPr>
-            <w:tcW w:type="dxa" w:w="4968"/>
+            <w:tcW w:type="dxa" w:w="4320"/>
           </w:tcPr>
           <w:p>
             <w:r>
@@ -1158,7 +1200,7 @@
         </w:tc>
         <w:tc>
           <w:tcPr>
-            <w:tcW w:type="dxa" w:w="4968"/>
+            <w:tcW w:type="dxa" w:w="4320"/>
           </w:tcPr>
           <w:p>
             <w:r>
@@ -1170,7 +1212,7 @@
       <w:tr>
         <w:tc>
           <w:tcPr>
-            <w:tcW w:type="dxa" w:w="4968"/>
+            <w:tcW w:type="dxa" w:w="4320"/>
           </w:tcPr>
           <w:p>
             <w:r>
@@ -1180,7 +1222,7 @@
         </w:tc>
         <w:tc>
           <w:tcPr>
-            <w:tcW w:type="dxa" w:w="4968"/>
+            <w:tcW w:type="dxa" w:w="4320"/>
           </w:tcPr>
           <w:p>
             <w:r>
@@ -1219,7 +1261,7 @@
         <w:pStyle w:val="ListBullet"/>
       </w:pPr>
       <w:r>
-        <w:t>If a new structure type is added, update roadmap, status, planner, HUD, directives, and config notes together.</w:t>
+        <w:t>If a new structure type is added, update roadmap, status, planner, HUD, directives, and docs together.</w:t>
       </w:r>
     </w:p>
     <w:p>
@@ -1227,37 +1269,17 @@
         <w:pStyle w:val="ListBullet"/>
       </w:pPr>
       <w:r>
-        <w:t>If a feature does not improve home-room stability, construction completion, controller throughput, or required defense, it should probably wait until after RCL8.</w:t>
+        <w:t>If a feature does not improve home-room stability, construction completion, controller throughput, or required defense, it should probably wait until after the home-room RCL8 path is stable.</w:t>
       </w:r>
     </w:p>
     <w:sectPr>
-      <w:footerReference w:type="default" r:id="rId9"/>
       <w:pgSz w:w="12240" w:h="15840"/>
-      <w:pgMar w:top="1008" w:right="1152" w:bottom="1008" w:left="1152" w:header="720" w:footer="720" w:gutter="0"/>
+      <w:pgMar w:top="1440" w:right="1800" w:bottom="1440" w:left="1800" w:header="720" w:footer="720" w:gutter="0"/>
       <w:cols w:space="720"/>
       <w:docGrid w:linePitch="360"/>
     </w:sectPr>
   </w:body>
 </w:document>
-</file>
-
-<file path=word/footer1.xml><?xml version="1.0" encoding="utf-8"?>
-<w:ftr xmlns:m="http://schemas.openxmlformats.org/officeDocument/2006/math" xmlns:mc="http://schemas.openxmlformats.org/markup-compatibility/2006" xmlns:mo="http://schemas.microsoft.com/office/mac/office/2008/main" xmlns:mv="urn:schemas-microsoft-com:mac:vml" xmlns:o="urn:schemas-microsoft-com:office:office" xmlns:r="http://schemas.openxmlformats.org/officeDocument/2006/relationships" xmlns:v="urn:schemas-microsoft-com:vml" xmlns:w10="urn:schemas-microsoft-com:office:word" xmlns:w14="http://schemas.microsoft.com/office/word/2010/wordml" xmlns:w="http://schemas.openxmlformats.org/wordprocessingml/2006/main" xmlns:wne="http://schemas.microsoft.com/office/word/2006/wordml" xmlns:wp14="http://schemas.microsoft.com/office/word/2010/wordprocessingDrawing" xmlns:wp="http://schemas.openxmlformats.org/drawingml/2006/wordprocessingDrawing" xmlns:wpc="http://schemas.microsoft.com/office/word/2010/wordprocessingCanvas" xmlns:wpg="http://schemas.microsoft.com/office/word/2010/wordprocessingGroup" xmlns:wpi="http://schemas.microsoft.com/office/word/2010/wordprocessingInk" xmlns:wps="http://schemas.microsoft.com/office/word/2010/wordprocessingShape" mc:Ignorable="w14 wp14">
-  <w:p>
-    <w:pPr>
-      <w:pStyle w:val="Footer"/>
-      <w:jc w:val="center"/>
-    </w:pPr>
-    <w:r>
-      <w:rPr>
-        <w:rFonts w:ascii="Aptos" w:hAnsi="Aptos"/>
-        <w:color w:val="666666"/>
-        <w:sz w:val="16"/>
-      </w:rPr>
-      <w:t>screeps_omega developer manual - current dev branch</w:t>
-    </w:r>
-  </w:p>
-</w:ftr>
 </file>
 
 <file path=word/numbering.xml><?xml version="1.0" encoding="utf-8"?>
@@ -1690,8 +1712,8 @@
       <w:rFonts w:asciiTheme="majorHAnsi" w:eastAsiaTheme="majorEastAsia" w:hAnsiTheme="majorHAnsi" w:cstheme="majorBidi" w:ascii="Aptos Display" w:hAnsi="Aptos Display"/>
       <w:b/>
       <w:bCs/>
-      <w:color w:val="1F4E79"/>
-      <w:sz w:val="34"/>
+      <w:color w:val="365F91" w:themeColor="accent1" w:themeShade="BF"/>
+      <w:sz w:val="28"/>
       <w:szCs w:val="28"/>
     </w:rPr>
   </w:style>
@@ -1714,7 +1736,7 @@
       <w:rFonts w:asciiTheme="majorHAnsi" w:eastAsiaTheme="majorEastAsia" w:hAnsiTheme="majorHAnsi" w:cstheme="majorBidi" w:ascii="Aptos Display" w:hAnsi="Aptos Display"/>
       <w:b/>
       <w:bCs/>
-      <w:color w:val="1F4E79"/>
+      <w:color w:val="4F81BD" w:themeColor="accent1"/>
       <w:sz w:val="26"/>
       <w:szCs w:val="26"/>
     </w:rPr>
@@ -1976,11 +1998,11 @@
       <w:contextualSpacing/>
     </w:pPr>
     <w:rPr>
-      <w:rFonts w:asciiTheme="majorHAnsi" w:eastAsiaTheme="majorEastAsia" w:hAnsiTheme="majorHAnsi" w:cstheme="majorBidi"/>
+      <w:rFonts w:asciiTheme="majorHAnsi" w:eastAsiaTheme="majorEastAsia" w:hAnsiTheme="majorHAnsi" w:cstheme="majorBidi" w:ascii="Aptos Display" w:hAnsi="Aptos Display"/>
       <w:color w:val="17365D" w:themeColor="text2" w:themeShade="BF"/>
       <w:spacing w:val="5"/>
       <w:kern w:val="28"/>
-      <w:sz w:val="52"/>
+      <w:sz w:val="40"/>
       <w:szCs w:val="52"/>
     </w:rPr>
   </w:style>

</xml_diff>

<commit_message>
Add advanced structure ops and private server test tooling
</commit_message>
<xml_diff>
--- a/docs/user_manual.docx
+++ b/docs/user_manual.docx
@@ -120,7 +120,7 @@
         <w:pStyle w:val="ListNumber"/>
       </w:pPr>
       <w:r>
-        <w:t>dev/room_manager.js runs one owned room through state collection, construction, towers, spawning, creeps, signing, directives, and HUD.</w:t>
+        <w:t>dev/room_manager.js runs one owned room through state collection, construction, late-structure operations, towers, spawning, creeps, signing, directives, and HUD.</w:t>
       </w:r>
     </w:p>
     <w:p>
@@ -389,7 +389,39 @@
     </w:p>
     <w:p>
       <w:r>
-        <w:t>The construction path now covers the full room buildout through command / RCL8. That means construction placement exists for late-game structures, but operating automation for labs, factory work, observer scans, power processing, and nuker use is still a separate gap.</w:t>
+        <w:t>The construction path now covers the full room buildout through command / RCL8. Late-structure runtime now also exists for lab reactions, conservative factory production, and staged hauling for labs, factory, power spawn, and nuker. Observer scans, power processing, and nuker firing policy are still separate remaining gaps.</w:t>
+      </w:r>
+    </w:p>
+    <w:p>
+      <w:pPr>
+        <w:pStyle w:val="Heading1"/>
+      </w:pPr>
+      <w:r>
+        <w:t>Advanced Structure Operations</w:t>
+      </w:r>
+    </w:p>
+    <w:p>
+      <w:pPr>
+        <w:pStyle w:val="ListBullet"/>
+      </w:pPr>
+      <w:r>
+        <w:t>advanced_structure_manager.js chooses lab reactions, runs lab cycles, drives conservative factory production, and plans advanced hauling from the shared room state.</w:t>
+      </w:r>
+    </w:p>
+    <w:p>
+      <w:pPr>
+        <w:pStyle w:val="ListBullet"/>
+      </w:pPr>
+      <w:r>
+        <w:t>Advanced haul support currently includes lab_cleanup, lab_output, lab_input, factory_output, factory_input, factory_energy, power_spawn_power, power_spawn_energy, nuker_ghodium, and nuker_energy.</w:t>
+      </w:r>
+    </w:p>
+    <w:p>
+      <w:pPr>
+        <w:pStyle w:val="ListBullet"/>
+      </w:pPr>
+      <w:r>
+        <w:t>The chosen advanced haul task is selected from config.ADVANCED.HAUL_TASK_PRIORITY, so late supply order can be tuned without changing code.</w:t>
       </w:r>
     </w:p>
     <w:p>
@@ -696,7 +728,7 @@
         <w:pStyle w:val="ListBullet"/>
       </w:pPr>
       <w:r>
-        <w:t>The construction checklist can show roadmap phase, future-plan readiness, and advanced structure progress.</w:t>
+        <w:t>The construction checklist can show roadmap phase, future-plan readiness, advanced structure progress, and the active late-structure haul task label.</w:t>
       </w:r>
     </w:p>
     <w:p>
@@ -776,6 +808,14 @@
         <w:pStyle w:val="ListBullet"/>
       </w:pPr>
       <w:r>
+        <w:t>Use ADVANCED for lab policy, factory policy, late-structure supply targets, and advanced haul task priority.</w:t>
+      </w:r>
+    </w:p>
+    <w:p>
+      <w:pPr>
+        <w:pStyle w:val="ListBullet"/>
+      </w:pPr>
+      <w:r>
         <w:t>Use CREEPS for target counts and think intervals.</w:t>
       </w:r>
     </w:p>
@@ -848,6 +888,14 @@
         <w:pStyle w:val="ListBullet"/>
       </w:pPr>
       <w:r>
+        <w:t>Memory.rooms[roomName].advancedOps stores the late-structure summary, cached lab layout, preferred lab product, and short advanced-haul task claims.</w:t>
+      </w:r>
+    </w:p>
+    <w:p>
+      <w:pPr>
+        <w:pStyle w:val="ListBullet"/>
+      </w:pPr>
+      <w:r>
         <w:t>Memory.rooms[roomName].defenseLayout stores the cached exit-choke wall and gate plan.</w:t>
       </w:r>
     </w:p>
@@ -888,7 +936,7 @@
         <w:pStyle w:val="ListBullet"/>
       </w:pPr>
       <w:r>
-        <w:t>Lab reactions are not yet automated beyond construction planning and placement.</w:t>
+        <w:t>Observer scan scheduling and downstream use of observer vision are not implemented yet.</w:t>
       </w:r>
     </w:p>
     <w:p>
@@ -896,7 +944,7 @@
         <w:pStyle w:val="ListBullet"/>
       </w:pPr>
       <w:r>
-        <w:t>Factory production policy is not yet implemented.</w:t>
+        <w:t>Power spawn processing and nuker firing policy are still missing beyond staged supply hauling.</w:t>
       </w:r>
     </w:p>
     <w:p>
@@ -904,15 +952,7 @@
         <w:pStyle w:val="ListBullet"/>
       </w:pPr>
       <w:r>
-        <w:t>Observer scans, power spawn processing, and nuker operation are not yet implemented beyond construction placement and status tracking.</w:t>
-      </w:r>
-    </w:p>
-    <w:p>
-      <w:pPr>
-        <w:pStyle w:val="ListBullet"/>
-      </w:pPr>
-      <w:r>
-        <w:t>Live validation is still needed for some late-game and terrain-heavy layouts even when the planners pass static checks.</w:t>
+        <w:t>Live validation is still needed for late-structure haul priority tuning and some terrain-heavy layout fallbacks even when the planners pass static checks.</w:t>
       </w:r>
     </w:p>
     <w:p>

</xml_diff>

<commit_message>
Improve container logistics and operator docs
</commit_message>
<xml_diff>
--- a/docs/user_manual.docx
+++ b/docs/user_manual.docx
@@ -107,7 +107,7 @@
         <w:pStyle w:val="ListBullet"/>
       </w:pPr>
       <w:r>
-        <w:t>Primary validation is the deterministic harness at scripts/validation/solo_room_harness.js. It currently passes bootstrap, foundation, development, logistics, specialization, fortification, command, bootstrap_harvest_spread, bootstrap_spawn_cap, and factory_ops.</w:t>
+        <w:t>Primary validation is the deterministic harness at scripts/validation/solo_room_harness.js. It currently passes bootstrap, foundation, development, logistics, specialization, fortification, command, bootstrap_harvest_spread, bootstrap_spawn_cap, storage_cap, container_usage, and factory_ops.</w:t>
       </w:r>
     </w:p>
     <w:p>
@@ -203,7 +203,7 @@
         <w:pStyle w:val="ListBullet"/>
       </w:pPr>
       <w:r>
-        <w:t>foundation: place source containers and the first durable road backbone.</w:t>
+        <w:t>foundation: place source containers, an early hub container, a controller container, and the first durable road backbone.</w:t>
       </w:r>
     </w:p>
     <w:p>
@@ -275,7 +275,7 @@
         <w:pStyle w:val="ListBullet"/>
       </w:pPr>
       <w:r>
-        <w:t>construction_manager.js places sites in roadmap order and respects the site cap.</w:t>
+        <w:t>construction_manager.js places sites in roadmap order, now including typed source, hub, and controller container planning, while respecting the site cap.</w:t>
       </w:r>
     </w:p>
     <w:p>
@@ -299,7 +299,7 @@
         <w:pStyle w:val="Heading1"/>
       </w:pPr>
       <w:r>
-        <w:t>Spawn And Workforce Behavior</w:t>
+        <w:t>Spawn, Workforce, And Container Flow</w:t>
       </w:r>
     </w:p>
     <w:p>
@@ -338,6 +338,11 @@
       <w:pPr>
         <w:pStyle w:val="ListBullet"/>
       </w:pPr>
+      <w:r>
+        <w:t>Container roles are now explicit: up to 3 source containers, 1 hub container near the anchor before storage, and 1 controller container until controller-link logistics take over. Workers prefer the hub buffer, upgraders prefer the controller buffer, and haulers refill those buffers before generic storage reserve work.</w:t>
+      </w:r>
+    </w:p>
+    <w:p>
       <w:r>
         <w:t>The shared move helper now uses the engine moveTo path first and only falls back to direct stepping when needed, which reduced pathing fragility in live PTR checks.</w:t>
       </w:r>
@@ -443,6 +448,26 @@
         <w:pStyle w:val="Heading1"/>
       </w:pPr>
       <w:r>
+        <w:t>Console Commands</w:t>
+      </w:r>
+    </w:p>
+    <w:p>
+      <w:pPr/>
+      <w:r>
+        <w:t>ops.help() prints the available console commands with a short description and one-line example so operator discovery stays in-game and current with the code.</w:t>
+      </w:r>
+    </w:p>
+    <w:p>
+      <w:pPr/>
+      <w:r>
+        <w:t>Use view("on") for a quick operator dashboard, ops.cpuStatus() for runtime pressure, ops.nextRCL() for controller ETA, and ops.hud()/ops.reports() to toggle display noise independently.</w:t>
+      </w:r>
+    </w:p>
+    <w:p>
+      <w:pPr>
+        <w:pStyle w:val="Heading1"/>
+      </w:pPr>
+      <w:r>
         <w:t>Configuration Surfaces</w:t>
       </w:r>
     </w:p>
@@ -482,6 +507,11 @@
       <w:pPr>
         <w:pStyle w:val="ListBullet"/>
       </w:pPr>
+      <w:r>
+        <w:t>Use config.LOGISTICS for storage caps plus hub/controller container fill targets.</w:t>
+      </w:r>
+    </w:p>
+    <w:p>
       <w:r>
         <w:t>Use config.STATS, config.HUD, and config.DIRECTIVES to control CPU visibility and operator noise.</w:t>
       </w:r>

</xml_diff>